<commit_message>
Finalise Review 3: merge introduction findings, workflow figure, 26-paper survey, traceability section
</commit_message>
<xml_diff>
--- a/report/Review_3_completed.docx
+++ b/report/Review_3_completed.docx
@@ -186,7 +186,7 @@
       </w:r>
     </w:p>
     <w:bookmarkEnd w:id="11"/>
-    <w:bookmarkStart w:id="16" w:name="introduction"/>
+    <w:bookmarkStart w:id="19" w:name="introduction"/>
     <w:p>
       <w:pPr>
         <w:pStyle w:val="Heading1"/>
@@ -204,7 +204,7 @@
         <w:t xml:space="preserve">Introduction</w:t>
       </w:r>
     </w:p>
-    <w:bookmarkStart w:id="12" w:name="Xdd9610076eb50ce8bdec31ef11e9419de35b244"/>
+    <w:bookmarkStart w:id="12" w:name="X85032571f4b64f48b6017a863f09fffc98316e3"/>
     <w:p>
       <w:pPr>
         <w:pStyle w:val="Heading2"/>
@@ -219,7 +219,7 @@
         <w:tab/>
       </w:r>
       <w:r>
-        <w:t xml:space="preserve">Background: Quantum Key Distribution in Shared WDM Optical Networks</w:t>
+        <w:t xml:space="preserve">Background and Context: Quantum Key Distribution in Shared WDM Optical Networks</w:t>
       </w:r>
     </w:p>
     <w:p>
@@ -227,7 +227,7 @@
         <w:pStyle w:val="FirstParagraph"/>
       </w:pPr>
       <w:r>
-        <w:t xml:space="preserve">The rapid maturation of quantum information processing threatens the mathematical foundations of asymmetric cryptosystems such as RSA and elliptic-curve cryptography. Quantum Key Distribution (QKD) addresses this vulnerability by enabling remote nodes to establish symmetric keys whose information-theoretic security rests on quantum mechanics, specifically the no-cloning theorem and measurement disturbance. In discrete-variable protocols such as decoy-state BB84, quantum states are encoded onto weak coherent pulses averaging fewer than one photon per pulse. Any interception attempt perturbs the states and shows up as a measurable rise in the Quantum Bit Error Rate (QBER), which alerts the legitimate parties to abort key extraction.</w:t>
+        <w:t xml:space="preserve">The security of most deployed public-key cryptography rests on the presumed hardness of problems such as integer factorisation and discrete logarithms, an assumption that large-scale quantum computation would undermine. Quantum Key Distribution (QKD) offers a different foundation: two parties expand a shared secret over an insecure quantum channel and an authenticated classical channel, and any attempt to intercept the quantum signals leaves a measurable trace in the Quantum Bit Error Rate (QBER). Since the first protocol was proposed by Bennett and Brassard (1984), the security of practical implementations with imperfect sources and detectors has been analysed in depth (Scarani et al., 2009), and the decoy-state technique of Lo, Ma and Chen (2005) made weak coherent laser pulses, averaging fewer than one photon each, compatible with rigorous security bounds.</w:t>
       </w:r>
     </w:p>
     <w:p>
@@ -235,7 +235,23 @@
         <w:pStyle w:val="BodyText"/>
       </w:pPr>
       <w:r>
-        <w:t xml:space="preserve">While early QKD testbeds relied on dedicated dark fibres, commercial deployment across metropolitan and wide-area networks requires multiplexing quantum channels onto existing WDM fibre plants alongside classical traffic. Coexistence in one fibre is difficult because of an extreme power disparity: classical channels launch at milliwatt levels (~0 dBm), whereas quantum channels operate at femtowatt scales (~10⁻¹⁶ W). Even when linear cross-talk is suppressed by high-isolation WDM filters, optical nonlinearities in the silica core generate in-band noise photons that cannot be filtered out. Hybrid architectures therefore usually assign classical traffic to the low-loss C-band (~1550 nm) and quantum transmission to the O-band (~1310 nm). This places the quantum channel on the weaker anti-Stokes side of the classical pump’s spontaneous Raman spectrum, trading higher O-band attenuation (0.32 dB/km vs 0.17 dB/km in the C-band) for a large reduction in nonlinear background noise.</w:t>
+        <w:t xml:space="preserve">As point-to-point links matured, attention moved to networks in which many node pairs obtain keys on demand. Cao et al. (2022) trace this evolution from isolated testbeds towards a large-scale quantum-secured infrastructure, and software-defined control planes have been shown to expose QKD resources as programmable network services (Cao et al., 2019; Wang et al., 2019). Dedicated dark fibre for every quantum link is rarely affordable outside trials, so a sustainable path is to carry quantum channels over the same wavelength-division-multiplexed (WDM) fibre plant that already transports classical traffic.</w:t>
+      </w:r>
+    </w:p>
+    <w:p>
+      <w:pPr>
+        <w:pStyle w:val="BodyText"/>
+      </w:pPr>
+      <w:r>
+        <w:t xml:space="preserve">Sharing a fibre is physically demanding because of an extreme power disparity: classical channels launch at milliwatt levels (~0 dBm), whereas quantum channels operate at femtowatt scales (~10⁻¹⁶ W). Filters suppress linear crosstalk, but nonlinear processes in silica create new photons at the quantum wavelength that cannot be filtered out. Chapuran et al. (2009) and Peters et al. (2009) identified spontaneous Raman scattering as the dominant impairment when a quantum channel coexists with strong classical signals. Eraerds et al. (2010) operated QKD alongside gigabit data on a single fibre, Patel et al. (2012) used temporal filtering to extend coexistence to 90 km, and Ferreira da Silva et al. (2014) quantified how Raman noise from many telecom channels accumulates in a quantum receiver. Hybrid architectures therefore usually place classical traffic in the low-loss C-band (~1550 nm) and quantum transmission in the O-band (~1310 nm), so that the quantum channel sees only the weaker anti-Stokes tail of the Raman spectrum, at the price of higher attenuation (0.32 dB/km against 0.17 dB/km).</w:t>
+      </w:r>
+    </w:p>
+    <w:p>
+      <w:pPr>
+        <w:pStyle w:val="BodyText"/>
+      </w:pPr>
+      <w:r>
+        <w:t xml:space="preserve">These findings move part of the security problem into the network layer. Which classical lightpaths share fibre with a quantum lightpath, over what distance and at what launch power, is decided by routing and wavelength assignment (RWA). For classical optical networks RWA is computationally hard (Chlamtac et al., 1992) and practical networks rely on heuristics such as shortest-path first-fit (Zang et al., 2000). In a hybrid network every routing decision for a classical channel also changes the noise floor of the quantum channels it overlaps, so RWA must respect a quantum signal-to-noise constraint in addition to wavelength availability.</w:t>
       </w:r>
     </w:p>
     <w:bookmarkEnd w:id="12"/>
@@ -881,7 +897,7 @@
       </w:r>
     </w:p>
     <w:bookmarkEnd w:id="13"/>
-    <w:bookmarkStart w:id="14" w:name="critical-limitations-of-the-base-paper"/>
+    <w:bookmarkStart w:id="14" w:name="X0b36090a33a0bec23789aee7e0022f0a4915536"/>
     <w:p>
       <w:pPr>
         <w:pStyle w:val="Heading2"/>
@@ -896,7 +912,7 @@
         <w:tab/>
       </w:r>
       <w:r>
-        <w:t xml:space="preserve">Critical Limitations of the Base Paper</w:t>
+        <w:t xml:space="preserve">Research Gaps and Limitations of Existing Work</w:t>
       </w:r>
     </w:p>
     <w:p>
@@ -904,7 +920,7 @@
         <w:pStyle w:val="FirstParagraph"/>
       </w:pPr>
       <w:r>
-        <w:t xml:space="preserve">Despite establishing the value of power-aware RWA, the base paper’s experimental design has three structural constraints that limit its direct applicability to carrier-grade networks:</w:t>
+        <w:t xml:space="preserve">The studies reviewed in Section 5 establish that resource allocation must account for the physical layer when quantum and classical signals share fibre. Five technical limitations nevertheless remain open, most visibly in the power-controlled heuristics of Ruiz and Garcia-Escartin (2026):</w:t>
       </w:r>
     </w:p>
     <w:p>
@@ -920,13 +936,13 @@
           <w:b/>
           <w:bCs/>
         </w:rPr>
-        <w:t xml:space="preserve">Static demand provisioning with one-shot power assignment.</w:t>
-      </w:r>
-      <w:r>
-        <w:t xml:space="preserve"> </w:t>
-      </w:r>
-      <w:r>
-        <w:t xml:space="preserve">Requests are known in advance and provisioned sequentially without departures, and launch power is computed once at set-up. In real transport networks connections arrive and depart stochastically, continuously changing the set of interferers on links shared with quantum channels. Slow physical drifts (connector degradation, thermal attenuation shifts, fibre ageing) also perturb classical SNR over time. A static, one-shot power setting cannot respond to mid-session QSNR erosion.</w:t>
+        <w:t xml:space="preserve">Static demand models.</w:t>
+      </w:r>
+      <w:r>
+        <w:t xml:space="preserve"> </w:t>
+      </w:r>
+      <w:r>
+        <w:t xml:space="preserve">Requests are known in advance and provisioned sequentially, without departures. In operational networks connections arrive and leave stochastically, so the set of classical interferers seen by a quantum channel changes throughout its lifetime. The authors themselves identify dynamic traffic assignment as future work.</w:t>
       </w:r>
     </w:p>
     <w:p>
@@ -942,13 +958,13 @@
           <w:b/>
           <w:bCs/>
         </w:rPr>
-        <w:t xml:space="preserve">Passive routing with strict wavelength continuity.</w:t>
-      </w:r>
-      <w:r>
-        <w:t xml:space="preserve"> </w:t>
-      </w:r>
-      <w:r>
-        <w:t xml:space="preserve">Without wavelength converters, every lightpath must use the same wavelength on all its links. Under dynamic arrivals and departures, spectral fragmentation can block requests even while raw bandwidth remains. How much this matters at realistic loads is one of the questions Section 8 answers.</w:t>
+        <w:t xml:space="preserve">One-shot launch-power assignment.</w:t>
+      </w:r>
+      <w:r>
+        <w:t xml:space="preserve"> </w:t>
+      </w:r>
+      <w:r>
+        <w:t xml:space="preserve">Classical launch power is computed once, from the path length at set-up, and is never revisited. It cannot react to new interferers, transient bursts of classical traffic, or slow drifts such as connector degradation and fibre ageing, any of which can push a quantum channel below its threshold or a classical receiver below its sensitivity in mid-session.</w:t>
       </w:r>
     </w:p>
     <w:p>
@@ -964,40 +980,61 @@
           <w:b/>
           <w:bCs/>
         </w:rPr>
-        <w:t xml:space="preserve">Bounded single-segment quantum reach (60 km simulation constraint).</w:t>
-      </w:r>
-      <w:r>
-        <w:t xml:space="preserve"> </w:t>
-      </w:r>
-      <w:r>
-        <w:t xml:space="preserve">The base study restricts generated topologies so that the longest candidate path never exceeds 60 km. This is a simulation design choice, not a physical ceiling of QKD, but unamplified single-segment quantum channels over shared, Raman-impaired fibre do decay exponentially. Distant node pairs cannot establish a direct single-segment key once attenuation and Raman noise push the end-to-end QSNR below</w:t>
-      </w:r>
-      <w:r>
-        <w:t xml:space="preserve"> </w:t>
-      </w:r>
-      <m:oMath>
-        <m:sSub>
-          <m:e>
-            <m:r>
-              <m:rPr>
-                <m:sty m:val="p"/>
-              </m:rPr>
-              <m:t>Γ</m:t>
-            </m:r>
-          </m:e>
-          <m:sub>
-            <m:r>
-              <m:t>Q</m:t>
-            </m:r>
-          </m:sub>
-        </m:sSub>
-      </m:oMath>
-      <w:r>
-        <w:t xml:space="preserve">.</w:t>
+        <w:t xml:space="preserve">Strict wavelength continuity.</w:t>
+      </w:r>
+      <w:r>
+        <w:t xml:space="preserve"> </w:t>
+      </w:r>
+      <w:r>
+        <w:t xml:space="preserve">The physics-aware heuristics assume networks without wavelength converters (Ruiz &amp; Garcia-Escartin, 2025, 2026). Conversion below the single-photon level is impractical, but converting classical channels alone would not touch the quantum path, and the benefit of sparse classical conversion, well established for classical networks (Subramaniam et al., 1996), has not been examined in hybrid networks. How much continuity blocking matters at realistic loads is one of the questions Section 8 answers.</w:t>
+      </w:r>
+    </w:p>
+    <w:p>
+      <w:pPr>
+        <w:pStyle w:val="Compact"/>
+        <w:numPr>
+          <w:ilvl w:val="0"/>
+          <w:numId w:val="1001"/>
+        </w:numPr>
+      </w:pPr>
+      <w:r>
+        <w:rPr>
+          <w:b/>
+          <w:bCs/>
+        </w:rPr>
+        <w:t xml:space="preserve">Bounded single-segment reach.</w:t>
+      </w:r>
+      <w:r>
+        <w:t xml:space="preserve"> </w:t>
+      </w:r>
+      <w:r>
+        <w:t xml:space="preserve">Topologies are generated so that no path exceeds 60 km. This is a deliberate simulation choice rather than a physical limit of QKD, but it leaves open how physics-aware RWA should serve node pairs whose shortest path is too long for one quantum segment. Trusted relays address reach in general (Cao et al., 2022; Kiktenko et al., 2024) but have not been combined with Raman-aware routing and power control.</w:t>
+      </w:r>
+    </w:p>
+    <w:p>
+      <w:pPr>
+        <w:pStyle w:val="Compact"/>
+        <w:numPr>
+          <w:ilvl w:val="0"/>
+          <w:numId w:val="1001"/>
+        </w:numPr>
+      </w:pPr>
+      <w:r>
+        <w:rPr>
+          <w:b/>
+          <w:bCs/>
+        </w:rPr>
+        <w:t xml:space="preserve">Open-loop control.</w:t>
+      </w:r>
+      <w:r>
+        <w:t xml:space="preserve"> </w:t>
+      </w:r>
+      <w:r>
+        <w:t xml:space="preserve">Software-defined QKD architectures (Cao et al., 2019; Wang et al., 2019) manage keys and services but do not close a control loop on physical-layer measurements such as the quantum signal-to-noise ratio. No existing scheme detects a quantum channel drifting towards outage and corrects it while the session is active.</w:t>
       </w:r>
     </w:p>
     <w:bookmarkEnd w:id="14"/>
-    <w:bookmarkStart w:id="15" w:name="X9baa9d303d6f7f307077b9f6b4f5a7ee6abec0e"/>
+    <w:bookmarkStart w:id="18" w:name="proposed-framework-and-contributions"/>
     <w:p>
       <w:pPr>
         <w:pStyle w:val="Heading2"/>
@@ -1012,7 +1049,7 @@
         <w:tab/>
       </w:r>
       <w:r>
-        <w:t xml:space="preserve">Overview of the Proposed T-DPC-RWA Framework</w:t>
+        <w:t xml:space="preserve">Proposed Framework and Contributions</w:t>
       </w:r>
     </w:p>
     <w:p>
@@ -1020,12 +1057,155 @@
         <w:pStyle w:val="FirstParagraph"/>
       </w:pPr>
       <w:r>
-        <w:t xml:space="preserve">Motivated by the base paper’s recommendation to explore dynamic traffic in future work, this study proposes Telemetry-Driven Dynamic Power Control and RWA (T-DPC-RWA) with sparse classical wavelength conversion and trusted relay segmentation. To keep attribution clean, the architecture separates noise mitigation, spectral-continuity relief and reach extension into three orthogonal mechanisms: (i) a closed-loop SDN telemetry controller that monitors active links and applies sensitivity-ordered classical power throttling followed by make-before-break (MBB) re-grooming; (ii) sparse O-E-O wavelength converters at high betweenness-centrality hubs, for classical channels only; and (iii) trusted relay nodes (explicitly distinguished from quantum repeaters) that terminate and re-establish QKD sessions over multi-hop chains.</w:t>
-      </w:r>
-    </w:p>
-    <w:bookmarkEnd w:id="15"/>
-    <w:bookmarkEnd w:id="16"/>
-    <w:bookmarkStart w:id="19" w:name="literature-survey"/>
+        <w:t xml:space="preserve">This study develops and evaluates Telemetry-Driven Dynamic Power Control and RWA (T-DPC-RWA) for hybrid quantum-classical networks under stochastic online traffic with Poisson arrivals and exponential holding times. Its objective is to extend physics-aware RWA from static provisioning to continuous operation, while keeping noise mitigation, spectrum relief and reach extension as separate mechanisms whose effects can be measured independently. The main contributions are:</w:t>
+      </w:r>
+    </w:p>
+    <w:p>
+      <w:pPr>
+        <w:pStyle w:val="Compact"/>
+        <w:numPr>
+          <w:ilvl w:val="0"/>
+          <w:numId w:val="1002"/>
+        </w:numPr>
+      </w:pPr>
+      <w:r>
+        <w:t xml:space="preserve">A time-variant, segment-aware model of anti-Stokes Raman noise that yields closed-form sensitivities of each quantum channel to the launch power of each classical segment (Section 7.1).</w:t>
+      </w:r>
+    </w:p>
+    <w:p>
+      <w:pPr>
+        <w:pStyle w:val="Compact"/>
+        <w:numPr>
+          <w:ilvl w:val="0"/>
+          <w:numId w:val="1002"/>
+        </w:numPr>
+      </w:pPr>
+      <w:r>
+        <w:t xml:space="preserve">A closed-loop control algorithm that polls the quantum and classical signal-to-noise ratios every</w:t>
+      </w:r>
+      <w:r>
+        <w:t xml:space="preserve"> </w:t>
+      </w:r>
+      <m:oMath>
+        <m:r>
+          <m:rPr>
+            <m:sty m:val="p"/>
+          </m:rPr>
+          <m:t>Δ</m:t>
+        </m:r>
+        <m:r>
+          <m:t>t</m:t>
+        </m:r>
+      </m:oMath>
+      <w:r>
+        <w:t xml:space="preserve"> </w:t>
+      </w:r>
+      <w:r>
+        <w:t xml:space="preserve">and, when a quantum channel enters a guard band, applies sensitivity-ordered power throttling and escalates to make-before-break re-grooming of the dominant interferer when throttling is insufficient, with hysteresis-based power recovery (Algorithm 1).</w:t>
+      </w:r>
+    </w:p>
+    <w:p>
+      <w:pPr>
+        <w:pStyle w:val="Compact"/>
+        <w:numPr>
+          <w:ilvl w:val="0"/>
+          <w:numId w:val="1002"/>
+        </w:numPr>
+      </w:pPr>
+      <w:r>
+        <w:t xml:space="preserve">Sparse optical-electrical-optical (O-E-O) wavelength conversion for classical channels only, placed at nodes of high betweenness centrality (Brandes, 2001) and exploited through a layered auxiliary graph, so that no active device enters the quantum path (Section 7.2).</w:t>
+      </w:r>
+    </w:p>
+    <w:p>
+      <w:pPr>
+        <w:pStyle w:val="Compact"/>
+        <w:numPr>
+          <w:ilvl w:val="0"/>
+          <w:numId w:val="1002"/>
+        </w:numPr>
+      </w:pPr>
+      <w:r>
+        <w:t xml:space="preserve">Trusted-relay segmentation that serves long-distance quantum requests through the relay chain with the highest bottleneck secret key rate under the decoy-state BB84 model (Lo et al., 2005); relays terminate and re-establish keys and are explicitly distinct from quantum repeaters (Section 7.3).</w:t>
+      </w:r>
+    </w:p>
+    <w:p>
+      <w:pPr>
+        <w:pStyle w:val="Compact"/>
+        <w:numPr>
+          <w:ilvl w:val="0"/>
+          <w:numId w:val="1002"/>
+        </w:numPr>
+      </w:pPr>
+      <w:r>
+        <w:t xml:space="preserve">A reproducible discrete-event evaluation on Gabriel and Waxman topologies with common random numbers, a factorial ablation of the three mechanisms, a decomposition of blocking into spectrum, noise and reach causes, and open-source code with a full traceability map from every reported value back to individual simulation runs (Sections 8.1–8.7).</w:t>
+      </w:r>
+    </w:p>
+    <w:p>
+      <w:pPr>
+        <w:pStyle w:val="FirstParagraph"/>
+      </w:pPr>
+      <w:r>
+        <w:t xml:space="preserve">Figure 1 summarises the resulting workflow: online provisioning (upper part) extends physics-aware RWA with sparse classical conversion and trusted-relay segmentation, and the telemetry loop (lower part) adds the closed-loop correction that static launch-power assignment lacks.</w:t>
+      </w:r>
+    </w:p>
+    <w:p>
+      <w:pPr>
+        <w:pStyle w:val="CaptionedFigure"/>
+      </w:pPr>
+      <w:r>
+        <w:drawing>
+          <wp:inline>
+            <wp:extent cx="4160520" cy="4221064"/>
+            <wp:effectExtent b="0" l="0" r="0" t="0"/>
+            <wp:docPr descr="Figure 1: Conceptual workflow of the proposed T-DPC-RWA framework: online request provisioning (Algorithm 2) and the closed-loop telemetry controller (Algorithm 1)." title="" id="16" name="Picture"/>
+            <a:graphic>
+              <a:graphicData uri="http://schemas.openxmlformats.org/drawingml/2006/picture">
+                <pic:pic>
+                  <pic:nvPicPr>
+                    <pic:cNvPr descr="img/fig_workflow.png" id="17" name="Picture"/>
+                    <pic:cNvPicPr>
+                      <a:picLocks noChangeArrowheads="1" noChangeAspect="1"/>
+                    </pic:cNvPicPr>
+                  </pic:nvPicPr>
+                  <pic:blipFill>
+                    <a:blip r:embed="rId15"/>
+                    <a:stretch>
+                      <a:fillRect/>
+                    </a:stretch>
+                  </pic:blipFill>
+                  <pic:spPr bwMode="auto">
+                    <a:xfrm>
+                      <a:off x="0" y="0"/>
+                      <a:ext cx="4160520" cy="4221064"/>
+                    </a:xfrm>
+                    <a:prstGeom prst="rect">
+                      <a:avLst/>
+                    </a:prstGeom>
+                    <a:noFill/>
+                    <a:ln w="9525">
+                      <a:noFill/>
+                      <a:headEnd/>
+                      <a:tailEnd/>
+                    </a:ln>
+                  </pic:spPr>
+                </pic:pic>
+              </a:graphicData>
+            </a:graphic>
+          </wp:inline>
+        </w:drawing>
+      </w:r>
+    </w:p>
+    <w:p>
+      <w:pPr>
+        <w:pStyle w:val="ImageCaption"/>
+      </w:pPr>
+      <w:r>
+        <w:t xml:space="preserve">Figure 1: Conceptual workflow of the proposed T-DPC-RWA framework: online request provisioning (Algorithm 2) and the closed-loop telemetry controller (Algorithm 1).</w:t>
+      </w:r>
+    </w:p>
+    <w:bookmarkEnd w:id="18"/>
+    <w:bookmarkEnd w:id="19"/>
+    <w:bookmarkStart w:id="22" w:name="literature-survey"/>
     <w:p>
       <w:pPr>
         <w:pStyle w:val="Heading1"/>
@@ -1048,10 +1228,10 @@
         <w:pStyle w:val="FirstParagraph"/>
       </w:pPr>
       <w:r>
-        <w:t xml:space="preserve">To establish a theoretical foundation, 20 research papers spanning hybrid quantum-classical multiplexing, RWA optimisation, SDN orchestration and physical-layer security were analysed. Section 5.1 gives a structured comparison and Section 5.2 detailed reviews.</w:t>
-      </w:r>
-    </w:p>
-    <w:bookmarkStart w:id="17" w:name="X19cb4fe390963651c9249ef71eed3e5095bc77b"/>
+        <w:t xml:space="preserve">To establish a theoretical foundation, 26 research papers spanning hybrid quantum-classical multiplexing, RWA optimisation, SDN orchestration and physical-layer security were analysed. Section 5.1 gives a structured comparison and Section 5.2 detailed reviews.</w:t>
+      </w:r>
+    </w:p>
+    <w:bookmarkStart w:id="20" w:name="X19cb4fe390963651c9249ef71eed3e5095bc77b"/>
     <w:p>
       <w:pPr>
         <w:pStyle w:val="Heading2"/>
@@ -2397,9 +2577,381 @@
           </w:p>
         </w:tc>
       </w:tr>
+      <w:tr>
+        <w:tc>
+          <w:tcPr/>
+          <w:p>
+            <w:pPr>
+              <w:pStyle w:val="Compact"/>
+              <w:jc w:val="left"/>
+            </w:pPr>
+            <w:r>
+              <w:t xml:space="preserve">21</w:t>
+            </w:r>
+          </w:p>
+        </w:tc>
+        <w:tc>
+          <w:tcPr/>
+          <w:p>
+            <w:pPr>
+              <w:pStyle w:val="Compact"/>
+              <w:jc w:val="left"/>
+            </w:pPr>
+            <w:r>
+              <w:t xml:space="preserve">Chapuran et al. (2009) — Optical networking for QKD and quantum communications</w:t>
+            </w:r>
+          </w:p>
+        </w:tc>
+        <w:tc>
+          <w:tcPr/>
+          <w:p>
+            <w:pPr>
+              <w:pStyle w:val="Compact"/>
+              <w:jc w:val="left"/>
+            </w:pPr>
+            <w:r>
+              <w:t xml:space="preserve">Experimental O-band QKD sharing fibre with amplified C-band data; Raman noise measurement and modelling.</w:t>
+            </w:r>
+          </w:p>
+        </w:tc>
+        <w:tc>
+          <w:tcPr/>
+          <w:p>
+            <w:pPr>
+              <w:pStyle w:val="Compact"/>
+              <w:jc w:val="left"/>
+            </w:pPr>
+            <w:r>
+              <w:t xml:space="preserve">Spontaneous anti-Stokes Raman scattering is the dominant coexistence impairment.</w:t>
+            </w:r>
+          </w:p>
+        </w:tc>
+        <w:tc>
+          <w:tcPr/>
+          <w:p>
+            <w:pPr>
+              <w:pStyle w:val="Compact"/>
+              <w:jc w:val="left"/>
+            </w:pPr>
+            <w:r>
+              <w:t xml:space="preserve">Adv: experimental grounding for O-band placement. Lim: link-level; no routing or network-wide allocation.</w:t>
+            </w:r>
+          </w:p>
+        </w:tc>
+      </w:tr>
+      <w:tr>
+        <w:tc>
+          <w:tcPr/>
+          <w:p>
+            <w:pPr>
+              <w:pStyle w:val="Compact"/>
+              <w:jc w:val="left"/>
+            </w:pPr>
+            <w:r>
+              <w:t xml:space="preserve">22</w:t>
+            </w:r>
+          </w:p>
+        </w:tc>
+        <w:tc>
+          <w:tcPr/>
+          <w:p>
+            <w:pPr>
+              <w:pStyle w:val="Compact"/>
+              <w:jc w:val="left"/>
+            </w:pPr>
+            <w:r>
+              <w:t xml:space="preserve">Eraerds et al. (2010) — QKD and 1 Gbps data encryption over a single fibre</w:t>
+            </w:r>
+          </w:p>
+        </w:tc>
+        <w:tc>
+          <w:tcPr/>
+          <w:p>
+            <w:pPr>
+              <w:pStyle w:val="Compact"/>
+              <w:jc w:val="left"/>
+            </w:pPr>
+            <w:r>
+              <w:t xml:space="preserve">QKD multiplexed with DWDM classical channels used for key distillation and encrypted traffic.</w:t>
+            </w:r>
+          </w:p>
+        </w:tc>
+        <w:tc>
+          <w:tcPr/>
+          <w:p>
+            <w:pPr>
+              <w:pStyle w:val="Compact"/>
+              <w:jc w:val="left"/>
+            </w:pPr>
+            <w:r>
+              <w:t xml:space="preserve">Practical single-fibre operation of QKD together with its own classical channels.</w:t>
+            </w:r>
+          </w:p>
+        </w:tc>
+        <w:tc>
+          <w:tcPr/>
+          <w:p>
+            <w:pPr>
+              <w:pStyle w:val="Compact"/>
+              <w:jc w:val="left"/>
+            </w:pPr>
+            <w:r>
+              <w:t xml:space="preserve">Adv: self-contained single-fibre system. Lim: fixed point-to-point link; no dynamic multi-user network.</w:t>
+            </w:r>
+          </w:p>
+        </w:tc>
+      </w:tr>
+      <w:tr>
+        <w:tc>
+          <w:tcPr/>
+          <w:p>
+            <w:pPr>
+              <w:pStyle w:val="Compact"/>
+              <w:jc w:val="left"/>
+            </w:pPr>
+            <w:r>
+              <w:t xml:space="preserve">23</w:t>
+            </w:r>
+          </w:p>
+        </w:tc>
+        <w:tc>
+          <w:tcPr/>
+          <w:p>
+            <w:pPr>
+              <w:pStyle w:val="Compact"/>
+              <w:jc w:val="left"/>
+            </w:pPr>
+            <w:r>
+              <w:t xml:space="preserve">Patel et al. (2012) — Coexistence of high-bit-rate QKD and data on optical fibre</w:t>
+            </w:r>
+          </w:p>
+        </w:tc>
+        <w:tc>
+          <w:tcPr/>
+          <w:p>
+            <w:pPr>
+              <w:pStyle w:val="Compact"/>
+              <w:jc w:val="left"/>
+            </w:pPr>
+            <w:r>
+              <w:t xml:space="preserve">Temporal filtering of Raman noise photons in high-bit-rate QKD.</w:t>
+            </w:r>
+          </w:p>
+        </w:tc>
+        <w:tc>
+          <w:tcPr/>
+          <w:p>
+            <w:pPr>
+              <w:pStyle w:val="Compact"/>
+              <w:jc w:val="left"/>
+            </w:pPr>
+            <w:r>
+              <w:t xml:space="preserve">Coexistence with bidirectional gigabit data over fibres up to 90 km.</w:t>
+            </w:r>
+          </w:p>
+        </w:tc>
+        <w:tc>
+          <w:tcPr/>
+          <w:p>
+            <w:pPr>
+              <w:pStyle w:val="Compact"/>
+              <w:jc w:val="left"/>
+            </w:pPr>
+            <w:r>
+              <w:t xml:space="preserve">Adv: long-reach coexistence. Lim: hardware-level mitigation; no routing or power allocation.</w:t>
+            </w:r>
+          </w:p>
+        </w:tc>
+      </w:tr>
+      <w:tr>
+        <w:tc>
+          <w:tcPr/>
+          <w:p>
+            <w:pPr>
+              <w:pStyle w:val="Compact"/>
+              <w:jc w:val="left"/>
+            </w:pPr>
+            <w:r>
+              <w:t xml:space="preserve">24</w:t>
+            </w:r>
+          </w:p>
+        </w:tc>
+        <w:tc>
+          <w:tcPr/>
+          <w:p>
+            <w:pPr>
+              <w:pStyle w:val="Compact"/>
+              <w:jc w:val="left"/>
+            </w:pPr>
+            <w:r>
+              <w:t xml:space="preserve">Ferreira da Silva et al. (2014) — Impact of Raman noise from multiple telecom channels on QKD</w:t>
+            </w:r>
+          </w:p>
+        </w:tc>
+        <w:tc>
+          <w:tcPr/>
+          <w:p>
+            <w:pPr>
+              <w:pStyle w:val="Compact"/>
+              <w:jc w:val="left"/>
+            </w:pPr>
+            <w:r>
+              <w:t xml:space="preserve">Analysis of Raman scattered noise accumulated from many co-propagating telecom channels.</w:t>
+            </w:r>
+          </w:p>
+        </w:tc>
+        <w:tc>
+          <w:tcPr/>
+          <w:p>
+            <w:pPr>
+              <w:pStyle w:val="Compact"/>
+              <w:jc w:val="left"/>
+            </w:pPr>
+            <w:r>
+              <w:t xml:space="preserve">Raman contributions from multiple classical channels add up in the quantum receiver.</w:t>
+            </w:r>
+          </w:p>
+        </w:tc>
+        <w:tc>
+          <w:tcPr/>
+          <w:p>
+            <w:pPr>
+              <w:pStyle w:val="Compact"/>
+              <w:jc w:val="left"/>
+            </w:pPr>
+            <w:r>
+              <w:t xml:space="preserve">Adv: multi-channel noise model. Lim: link-level; launch power and routing taken as given.</w:t>
+            </w:r>
+          </w:p>
+        </w:tc>
+      </w:tr>
+      <w:tr>
+        <w:tc>
+          <w:tcPr/>
+          <w:p>
+            <w:pPr>
+              <w:pStyle w:val="Compact"/>
+              <w:jc w:val="left"/>
+            </w:pPr>
+            <w:r>
+              <w:t xml:space="preserve">25</w:t>
+            </w:r>
+          </w:p>
+        </w:tc>
+        <w:tc>
+          <w:tcPr/>
+          <w:p>
+            <w:pPr>
+              <w:pStyle w:val="Compact"/>
+              <w:jc w:val="left"/>
+            </w:pPr>
+            <w:r>
+              <w:t xml:space="preserve">Birand et al. (2014) — Real-time power control for dynamic optical networks</w:t>
+            </w:r>
+          </w:p>
+        </w:tc>
+        <w:tc>
+          <w:tcPr/>
+          <w:p>
+            <w:pPr>
+              <w:pStyle w:val="Compact"/>
+              <w:jc w:val="left"/>
+            </w:pPr>
+            <w:r>
+              <w:t xml:space="preserve">Real-time power control algorithms for dynamic classical optical networks, validated experimentally.</w:t>
+            </w:r>
+          </w:p>
+        </w:tc>
+        <w:tc>
+          <w:tcPr/>
+          <w:p>
+            <w:pPr>
+              <w:pStyle w:val="Compact"/>
+              <w:jc w:val="left"/>
+            </w:pPr>
+            <w:r>
+              <w:t xml:space="preserve">Closed-loop power adjustment is feasible as channels are added and removed.</w:t>
+            </w:r>
+          </w:p>
+        </w:tc>
+        <w:tc>
+          <w:tcPr/>
+          <w:p>
+            <w:pPr>
+              <w:pStyle w:val="Compact"/>
+              <w:jc w:val="left"/>
+            </w:pPr>
+            <w:r>
+              <w:t xml:space="preserve">Adv: demonstrates dynamic power control. Lim: classical networks only; no quantum SNR constraint.</w:t>
+            </w:r>
+          </w:p>
+        </w:tc>
+      </w:tr>
+      <w:tr>
+        <w:tc>
+          <w:tcPr/>
+          <w:p>
+            <w:pPr>
+              <w:pStyle w:val="Compact"/>
+              <w:jc w:val="left"/>
+            </w:pPr>
+            <w:r>
+              <w:t xml:space="preserve">26</w:t>
+            </w:r>
+          </w:p>
+        </w:tc>
+        <w:tc>
+          <w:tcPr/>
+          <w:p>
+            <w:pPr>
+              <w:pStyle w:val="Compact"/>
+              <w:jc w:val="left"/>
+            </w:pPr>
+            <w:r>
+              <w:t xml:space="preserve">Zhang et al. (2023) — Routing, channel, key-rate and time-slot assignment for QKD in optical networks</w:t>
+            </w:r>
+          </w:p>
+        </w:tc>
+        <w:tc>
+          <w:tcPr/>
+          <w:p>
+            <w:pPr>
+              <w:pStyle w:val="Compact"/>
+              <w:jc w:val="left"/>
+            </w:pPr>
+            <w:r>
+              <w:t xml:space="preserve">Joint routing, channel, key-rate and time-slot assignment for QKD services.</w:t>
+            </w:r>
+          </w:p>
+        </w:tc>
+        <w:tc>
+          <w:tcPr/>
+          <w:p>
+            <w:pPr>
+              <w:pStyle w:val="Compact"/>
+              <w:jc w:val="left"/>
+            </w:pPr>
+            <w:r>
+              <w:t xml:space="preserve">Unified treatment of key-rate demands inside resource assignment.</w:t>
+            </w:r>
+          </w:p>
+        </w:tc>
+        <w:tc>
+          <w:tcPr/>
+          <w:p>
+            <w:pPr>
+              <w:pStyle w:val="Compact"/>
+              <w:jc w:val="left"/>
+            </w:pPr>
+            <w:r>
+              <w:t xml:space="preserve">Adv: key-rate-aware allocation. Lim: Raman-aware power control and closed-loop supervision absent.</w:t>
+            </w:r>
+          </w:p>
+        </w:tc>
+      </w:tr>
     </w:tbl>
-    <w:bookmarkEnd w:id="17"/>
-    <w:bookmarkStart w:id="18" w:name="X6d62a070a82fa19a163e64e15afa75a4a793dbe"/>
+    <w:bookmarkEnd w:id="20"/>
+    <w:bookmarkStart w:id="21" w:name="X6d62a070a82fa19a163e64e15afa75a4a793dbe"/>
     <w:p>
       <w:pPr>
         <w:pStyle w:val="Heading2"/>
@@ -2777,9 +3329,117 @@
         <w:t xml:space="preserve">review geometrical-optics-restricted QKD models for free-space optical links. Replacing the assumption of an omnipotent eavesdropper who collects all scattered photons with physically bounded receiver apertures yields tighter, more practical secret-key-rate bounds for line-of-sight quantum links.</w:t>
       </w:r>
     </w:p>
-    <w:bookmarkEnd w:id="18"/>
-    <w:bookmarkEnd w:id="19"/>
-    <w:bookmarkStart w:id="24" w:name="proposed-system-architecture"/>
+    <w:p>
+      <w:pPr>
+        <w:pStyle w:val="BodyText"/>
+      </w:pPr>
+      <w:r>
+        <w:rPr>
+          <w:b/>
+          <w:bCs/>
+        </w:rPr>
+        <w:t xml:space="preserve">Chapuran et al. (2009)</w:t>
+      </w:r>
+      <w:r>
+        <w:t xml:space="preserve"> </w:t>
+      </w:r>
+      <w:r>
+        <w:t xml:space="preserve">operated QKD in the O-band over fibre shared with optically amplified C-band data channels and identified spontaneous anti-Stokes Raman scattering of the strong classical signals as the dominant impairment, measuring and modelling its propagation through the fibre. Their work provides the experimental basis for the O-band/C-band channel plan used in this study, but it remains a link-level analysis without routing or network-wide resource allocation.</w:t>
+      </w:r>
+    </w:p>
+    <w:p>
+      <w:pPr>
+        <w:pStyle w:val="BodyText"/>
+      </w:pPr>
+      <w:r>
+        <w:rPr>
+          <w:b/>
+          <w:bCs/>
+        </w:rPr>
+        <w:t xml:space="preserve">Eraerds et al. (2010)</w:t>
+      </w:r>
+      <w:r>
+        <w:t xml:space="preserve"> </w:t>
+      </w:r>
+      <w:r>
+        <w:t xml:space="preserve">performed QKD over a single fibre together with DWDM classical channels that carried both the key-distillation traffic and 1 Gbps of encrypted data, making the whole system independent of any other communication channel. The demonstration confirmed practical single-fibre coexistence on a fixed point-to-point link.</w:t>
+      </w:r>
+    </w:p>
+    <w:p>
+      <w:pPr>
+        <w:pStyle w:val="BodyText"/>
+      </w:pPr>
+      <w:r>
+        <w:rPr>
+          <w:b/>
+          <w:bCs/>
+        </w:rPr>
+        <w:t xml:space="preserve">Patel et al. (2012)</w:t>
+      </w:r>
+      <w:r>
+        <w:t xml:space="preserve"> </w:t>
+      </w:r>
+      <w:r>
+        <w:t xml:space="preserve">exploited a temporal-filtering effect to reject Raman noise photons, enabling high-bit-rate QKD over fibres of up to 90 km that also carried error-free bidirectional gigabit data. The mitigation acts in the receiver hardware and is complementary to the network-level measures studied here.</w:t>
+      </w:r>
+    </w:p>
+    <w:p>
+      <w:pPr>
+        <w:pStyle w:val="BodyText"/>
+      </w:pPr>
+      <w:r>
+        <w:rPr>
+          <w:b/>
+          <w:bCs/>
+        </w:rPr>
+        <w:t xml:space="preserve">Ferreira da Silva et al. (2014)</w:t>
+      </w:r>
+      <w:r>
+        <w:t xml:space="preserve"> </w:t>
+      </w:r>
+      <w:r>
+        <w:t xml:space="preserve">analysed the Raman noise that many co-propagating telecom channels contribute to a fibre-optic QKD receiver, showing how the contributions accumulate. This multi-channel view underlies the summation over interfering classical segments in the noise model of Section 7.1.</w:t>
+      </w:r>
+    </w:p>
+    <w:p>
+      <w:pPr>
+        <w:pStyle w:val="BodyText"/>
+      </w:pPr>
+      <w:r>
+        <w:rPr>
+          <w:b/>
+          <w:bCs/>
+        </w:rPr>
+        <w:t xml:space="preserve">Birand et al. (2014)</w:t>
+      </w:r>
+      <w:r>
+        <w:t xml:space="preserve"> </w:t>
+      </w:r>
+      <w:r>
+        <w:t xml:space="preserve">studied real-time power control in dynamic classical optical networks, with algorithms validated experimentally, showing that launch powers can be adjusted in closed loop as channels are added and removed. Their setting does not include quantum channels, but it supports the feasibility of the telemetry-driven power adaptation proposed here.</w:t>
+      </w:r>
+    </w:p>
+    <w:p>
+      <w:pPr>
+        <w:pStyle w:val="BodyText"/>
+      </w:pPr>
+      <w:r>
+        <w:rPr>
+          <w:b/>
+          <w:bCs/>
+        </w:rPr>
+        <w:t xml:space="preserve">Zhang et al. (2023)</w:t>
+      </w:r>
+      <w:r>
+        <w:t xml:space="preserve"> </w:t>
+      </w:r>
+      <w:r>
+        <w:t xml:space="preserve">jointly address routing, channel, key-rate and time-slot assignment for QKD services in optical networks, treating key-rate demands as part of resource assignment. The formulation does not model Raman cross-talk between quantum and classical channels or adapt launch powers during operation.</w:t>
+      </w:r>
+    </w:p>
+    <w:bookmarkEnd w:id="21"/>
+    <w:bookmarkEnd w:id="22"/>
+    <w:bookmarkStart w:id="27" w:name="proposed-system-architecture"/>
     <w:p>
       <w:pPr>
         <w:pStyle w:val="Heading1"/>
@@ -2802,7 +3462,7 @@
         <w:pStyle w:val="FirstParagraph"/>
       </w:pPr>
       <w:r>
-        <w:t xml:space="preserve">To address the static provisioning, wavelength continuity and single-segment reach limitations of the base paper while keeping concerns separate, we design a four-tier Software-Defined Networking (SDN) architecture, the T-DPC-RWA framework. As illustrated in Figure 1, it integrates an Application Layer, a centralised SDN Control Plane, a Hybrid Quantum-Classical Data Plane, and a continuous monitoring and telemetry loop.</w:t>
+        <w:t xml:space="preserve">To address the static provisioning, wavelength continuity and single-segment reach limitations of the base paper while keeping concerns separate, we design a four-tier Software-Defined Networking (SDN) architecture, the T-DPC-RWA framework. As illustrated in Figure 2, it integrates an Application Layer, a centralised SDN Control Plane, a Hybrid Quantum-Classical Data Plane, and a continuous monitoring and telemetry loop.</w:t>
       </w:r>
     </w:p>
     <w:p>
@@ -2814,18 +3474,18 @@
           <wp:inline>
             <wp:extent cx="5334000" cy="3493812"/>
             <wp:effectExtent b="0" l="0" r="0" t="0"/>
-            <wp:docPr descr="Figure 1: System architecture of the proposed closed-loop T-DPC-RWA framework with sparse classical O-E-O conversion and trusted relay nodes." title="" id="21" name="Picture"/>
+            <wp:docPr descr="Figure 2: System architecture of the proposed closed-loop T-DPC-RWA framework with sparse classical O-E-O conversion and trusted relay nodes." title="" id="24" name="Picture"/>
             <a:graphic>
               <a:graphicData uri="http://schemas.openxmlformats.org/drawingml/2006/picture">
                 <pic:pic>
                   <pic:nvPicPr>
-                    <pic:cNvPr descr="img/fig1_architecture.png" id="22" name="Picture"/>
+                    <pic:cNvPr descr="img/fig1_architecture.png" id="25" name="Picture"/>
                     <pic:cNvPicPr>
                       <a:picLocks noChangeArrowheads="1" noChangeAspect="1"/>
                     </pic:cNvPicPr>
                   </pic:nvPicPr>
                   <pic:blipFill>
-                    <a:blip r:embed="rId20"/>
+                    <a:blip r:embed="rId23"/>
                     <a:stretch>
                       <a:fillRect/>
                     </a:stretch>
@@ -2857,10 +3517,10 @@
         <w:pStyle w:val="ImageCaption"/>
       </w:pPr>
       <w:r>
-        <w:t xml:space="preserve">Figure 1: System architecture of the proposed closed-loop T-DPC-RWA framework with sparse classical O-E-O conversion and trusted relay nodes.</w:t>
-      </w:r>
-    </w:p>
-    <w:bookmarkStart w:id="23" w:name="X034a5a63fdc85c66a4aa48987fcd94f94f957cd"/>
+        <w:t xml:space="preserve">Figure 2: System architecture of the proposed closed-loop T-DPC-RWA framework with sparse classical O-E-O conversion and trusted relay nodes.</w:t>
+      </w:r>
+    </w:p>
+    <w:bookmarkStart w:id="26" w:name="X034a5a63fdc85c66a4aa48987fcd94f94f957cd"/>
     <w:p>
       <w:pPr>
         <w:pStyle w:val="Heading2"/>
@@ -2883,7 +3543,7 @@
         <w:pStyle w:val="Compact"/>
         <w:numPr>
           <w:ilvl w:val="0"/>
-          <w:numId w:val="1002"/>
+          <w:numId w:val="1003"/>
         </w:numPr>
       </w:pPr>
       <w:r>
@@ -3043,7 +3703,7 @@
         <w:pStyle w:val="Compact"/>
         <w:numPr>
           <w:ilvl w:val="0"/>
-          <w:numId w:val="1002"/>
+          <w:numId w:val="1003"/>
         </w:numPr>
       </w:pPr>
       <w:r>
@@ -3146,7 +3806,7 @@
         <w:pStyle w:val="Compact"/>
         <w:numPr>
           <w:ilvl w:val="0"/>
-          <w:numId w:val="1002"/>
+          <w:numId w:val="1003"/>
         </w:numPr>
       </w:pPr>
       <w:r>
@@ -3168,7 +3828,7 @@
         <w:pStyle w:val="Compact"/>
         <w:numPr>
           <w:ilvl w:val="0"/>
-          <w:numId w:val="1002"/>
+          <w:numId w:val="1003"/>
         </w:numPr>
       </w:pPr>
       <w:r>
@@ -3205,9 +3865,9 @@
         <w:t xml:space="preserve">seconds, closing the loop so that drift and cross-talk bursts are corrected before outage occurs.</w:t>
       </w:r>
     </w:p>
-    <w:bookmarkEnd w:id="23"/>
-    <w:bookmarkEnd w:id="24"/>
-    <w:bookmarkStart w:id="29" w:name="proposed-methodology"/>
+    <w:bookmarkEnd w:id="26"/>
+    <w:bookmarkEnd w:id="27"/>
+    <w:bookmarkStart w:id="32" w:name="proposed-methodology"/>
     <w:p>
       <w:pPr>
         <w:pStyle w:val="Heading1"/>
@@ -3233,7 +3893,7 @@
         <w:t xml:space="preserve">Our methodology extends the base paper along three orthogonal dimensions, keeping each mechanism mathematically distinct so that its individual effect can be isolated by factorial ablation.</w:t>
       </w:r>
     </w:p>
-    <w:bookmarkStart w:id="25" w:name="X65e9b4b041c2c51dd937c34d026f5aafa008cf5"/>
+    <w:bookmarkStart w:id="28" w:name="X65e9b4b041c2c51dd937c34d026f5aafa008cf5"/>
     <w:p>
       <w:pPr>
         <w:pStyle w:val="Heading2"/>
@@ -6904,8 +7564,8 @@
         </w:tc>
       </w:tr>
     </w:tbl>
-    <w:bookmarkEnd w:id="25"/>
-    <w:bookmarkStart w:id="26" w:name="X172f9d1afcd1d43d38529533c660f1e70de822f"/>
+    <w:bookmarkEnd w:id="28"/>
+    <w:bookmarkStart w:id="29" w:name="X172f9d1afcd1d43d38529533c660f1e70de822f"/>
     <w:p>
       <w:pPr>
         <w:pStyle w:val="Heading2"/>
@@ -7376,8 +8036,8 @@
         <w:t xml:space="preserve">transponder pairs. Converters act only on C-band classical channels; O-band quantum channels bypass them through passive waveband splitters.</w:t>
       </w:r>
     </w:p>
-    <w:bookmarkEnd w:id="26"/>
-    <w:bookmarkStart w:id="27" w:name="X2180f1b4613bd3d6bfaf71b578eaf50a39dcf37"/>
+    <w:bookmarkEnd w:id="29"/>
+    <w:bookmarkStart w:id="30" w:name="X2180f1b4613bd3d6bfaf71b578eaf50a39dcf37"/>
     <w:p>
       <w:pPr>
         <w:pStyle w:val="Heading2"/>
@@ -8775,8 +9435,8 @@
         <w:t xml:space="preserve">. Trusted relays are explicitly distinct from quantum repeaters: they measure photons and process classical bits, without quantum memories or entanglement swapping.</w:t>
       </w:r>
     </w:p>
-    <w:bookmarkEnd w:id="27"/>
-    <w:bookmarkStart w:id="28" w:name="X6e3832f6cbf7c94f795606620b8ac2169c2ba66"/>
+    <w:bookmarkEnd w:id="30"/>
+    <w:bookmarkStart w:id="31" w:name="X6e3832f6cbf7c94f795606620b8ac2169c2ba66"/>
     <w:p>
       <w:pPr>
         <w:pStyle w:val="Heading2"/>
@@ -12749,9 +13409,9 @@
         <w:br w:type="page"/>
       </w:r>
     </w:p>
-    <w:bookmarkEnd w:id="28"/>
-    <w:bookmarkEnd w:id="29"/>
-    <w:bookmarkStart w:id="45" w:name="X69281f989bfeb399690f83870ce790a55b57723"/>
+    <w:bookmarkEnd w:id="31"/>
+    <w:bookmarkEnd w:id="32"/>
+    <w:bookmarkStart w:id="49" w:name="X69281f989bfeb399690f83870ce790a55b57723"/>
     <w:p>
       <w:pPr>
         <w:pStyle w:val="Heading1"/>
@@ -12769,7 +13429,7 @@
         <w:t xml:space="preserve">Implementation Details, Results and Discussion</w:t>
       </w:r>
     </w:p>
-    <w:bookmarkStart w:id="30" w:name="X09049c0d49238feebb612c4bd536d5ba018edb8"/>
+    <w:bookmarkStart w:id="33" w:name="X09049c0d49238feebb612c4bd536d5ba018edb8"/>
     <w:p>
       <w:pPr>
         <w:pStyle w:val="Heading2"/>
@@ -12871,7 +13531,7 @@
         <w:t xml:space="preserve"> </w:t>
       </w:r>
       <w:r>
-        <w:t xml:space="preserve">nodes: Gabriel graphs, which are planar and sparse (measured mean nodal degree 3.20), and Waxman graphs with</w:t>
+        <w:t xml:space="preserve">nodes: Gabriel graphs (Gabriel &amp; Sokal, 1969), which are planar and sparse (measured mean nodal degree 3.20), and Waxman graphs (Waxman, 1988) with</w:t>
       </w:r>
       <w:r>
         <w:t xml:space="preserve"> </w:t>
@@ -13518,8 +14178,8 @@
         </w:tc>
       </w:tr>
     </w:tbl>
-    <w:bookmarkEnd w:id="30"/>
-    <w:bookmarkStart w:id="34" w:name="X23c3d283d9743100df3d705a42df308949a0c57"/>
+    <w:bookmarkEnd w:id="33"/>
+    <w:bookmarkStart w:id="37" w:name="X23c3d283d9743100df3d705a42df308949a0c57"/>
     <w:p>
       <w:pPr>
         <w:pStyle w:val="Heading2"/>
@@ -13542,7 +14202,7 @@
         <w:pStyle w:val="FirstParagraph"/>
       </w:pPr>
       <w:r>
-        <w:t xml:space="preserve">Figure 2(a) shows the RBR from 10 to 100 Erlang on 20-node Waxman topologies (</w:t>
+        <w:t xml:space="preserve">Figure 3(a) shows the RBR from 10 to 100 Erlang on 20-node Waxman topologies (</w:t>
       </w:r>
       <m:oMath>
         <m:sSub>
@@ -13576,7 +14236,7 @@
         <w:pStyle w:val="BodyText"/>
       </w:pPr>
       <w:r>
-        <w:t xml:space="preserve">Figure 2(b) explains why. At 80 Erlang, about 97% of MQCCO’s blocking is</w:t>
+        <w:t xml:space="preserve">Figure 3(b) explains why. At 80 Erlang, about 97% of MQCCO’s blocking is</w:t>
       </w:r>
       <w:r>
         <w:t xml:space="preserve"> </w:t>
@@ -13601,18 +14261,18 @@
           <wp:inline>
             <wp:extent cx="5334000" cy="2051538"/>
             <wp:effectExtent b="0" l="0" r="0" t="0"/>
-            <wp:docPr descr="Figure 2: (a) Request blocking ratio vs offered load in 20-node Waxman topologies (log scale); (b) decomposition of blocking causes at 80 Erlang." title="" id="32" name="Picture"/>
+            <wp:docPr descr="Figure 3: (a) Request blocking ratio vs offered load in 20-node Waxman topologies (log scale); (b) decomposition of blocking causes at 80 Erlang." title="" id="35" name="Picture"/>
             <a:graphic>
               <a:graphicData uri="http://schemas.openxmlformats.org/drawingml/2006/picture">
                 <pic:pic>
                   <pic:nvPicPr>
-                    <pic:cNvPr descr="fig/fig1_rbr.png" id="33" name="Picture"/>
+                    <pic:cNvPr descr="fig/fig1_rbr.png" id="36" name="Picture"/>
                     <pic:cNvPicPr>
                       <a:picLocks noChangeArrowheads="1" noChangeAspect="1"/>
                     </pic:cNvPicPr>
                   </pic:nvPicPr>
                   <pic:blipFill>
-                    <a:blip r:embed="rId31"/>
+                    <a:blip r:embed="rId34"/>
                     <a:stretch>
                       <a:fillRect/>
                     </a:stretch>
@@ -13644,11 +14304,11 @@
         <w:pStyle w:val="ImageCaption"/>
       </w:pPr>
       <w:r>
-        <w:t xml:space="preserve">Figure 2: (a) Request blocking ratio vs offered load in 20-node Waxman topologies (log scale); (b) decomposition of blocking causes at 80 Erlang.</w:t>
-      </w:r>
-    </w:p>
-    <w:bookmarkEnd w:id="34"/>
-    <w:bookmarkStart w:id="38" w:name="Xc2acbe32c0328a9a8ce240b075b25e71d8f8b08"/>
+        <w:t xml:space="preserve">Figure 3: (a) Request blocking ratio vs offered load in 20-node Waxman topologies (log scale); (b) decomposition of blocking causes at 80 Erlang.</w:t>
+      </w:r>
+    </w:p>
+    <w:bookmarkEnd w:id="37"/>
+    <w:bookmarkStart w:id="41" w:name="Xc2acbe32c0328a9a8ce240b075b25e71d8f8b08"/>
     <w:p>
       <w:pPr>
         <w:pStyle w:val="Heading2"/>
@@ -13671,7 +14331,7 @@
         <w:pStyle w:val="FirstParagraph"/>
       </w:pPr>
       <w:r>
-        <w:t xml:space="preserve">Figure 3 compares the time-averaged QSNR and asymptotic decoy-state BB84 SKR (Eq. (6)) across loads. Without power control, co-propagating 1 mW classical channels hold the mean QSNR of admitted sessions at 3.1 dB at 80 Erlang, against 6.1 dB for static MQCCO, 7.0 dB for the T-DPC loop alone and 7.1 dB for the full framework (+1.1 dB over MQCCO). The gain comes from the telemetry loop, which removes burst cross-talk within one polling interval; it is achieved even though relay chains admit long-distance sessions whose segments sit closer to the threshold. Those long sessions do, however, lower the key rate per session: the mean SKR per session at 80 Erlang is 0.44 × 10⁻³ (SP-FF), 0.51 × 10⁻³ (MQCCO) and 0.27 × 10⁻³ bits/pulse (full framework), since a relay chain’s rate is that of its weakest segment. Measured as network key throughput, the sum of key rates over all active sessions, the full framework delivers 6.09 × 10⁻³ bits/pulse against 5.63 × 10⁻³ for MQCCO (+8.2%), because it serves many more sessions (Table 3).</w:t>
+        <w:t xml:space="preserve">Figure 4 compares the time-averaged QSNR and asymptotic decoy-state BB84 SKR (Eq. (6)) across loads. Without power control, co-propagating 1 mW classical channels hold the mean QSNR of admitted sessions at 3.1 dB at 80 Erlang, against 6.1 dB for static MQCCO, 7.0 dB for the T-DPC loop alone and 7.1 dB for the full framework (+1.1 dB over MQCCO). The gain comes from the telemetry loop, which removes burst cross-talk within one polling interval; it is achieved even though relay chains admit long-distance sessions whose segments sit closer to the threshold. Those long sessions do, however, lower the key rate per session: the mean SKR per session at 80 Erlang is 0.44 × 10⁻³ (SP-FF), 0.51 × 10⁻³ (MQCCO) and 0.27 × 10⁻³ bits/pulse (full framework), since a relay chain’s rate is that of its weakest segment. Measured as network key throughput, the sum of key rates over all active sessions, the full framework delivers 6.09 × 10⁻³ bits/pulse against 5.63 × 10⁻³ for MQCCO (+8.2%), because it serves many more sessions (Table 3).</w:t>
       </w:r>
     </w:p>
     <w:p>
@@ -13683,18 +14343,18 @@
           <wp:inline>
             <wp:extent cx="5334000" cy="2051538"/>
             <wp:effectExtent b="0" l="0" r="0" t="0"/>
-            <wp:docPr descr="Figure 3: (a) Time-averaged quantum SNR vs offered load; (b) asymptotic decoy-state BB84 secret key rate per session (×10⁻³ bits/pulse), 20-node Waxman." title="" id="36" name="Picture"/>
+            <wp:docPr descr="Figure 4: (a) Time-averaged quantum SNR vs offered load; (b) asymptotic decoy-state BB84 secret key rate per session (×10⁻³ bits/pulse), 20-node Waxman." title="" id="39" name="Picture"/>
             <a:graphic>
               <a:graphicData uri="http://schemas.openxmlformats.org/drawingml/2006/picture">
                 <pic:pic>
                   <pic:nvPicPr>
-                    <pic:cNvPr descr="fig/fig2_qsnr_skr.png" id="37" name="Picture"/>
+                    <pic:cNvPr descr="fig/fig2_qsnr_skr.png" id="40" name="Picture"/>
                     <pic:cNvPicPr>
                       <a:picLocks noChangeArrowheads="1" noChangeAspect="1"/>
                     </pic:cNvPicPr>
                   </pic:nvPicPr>
                   <pic:blipFill>
-                    <a:blip r:embed="rId35"/>
+                    <a:blip r:embed="rId38"/>
                     <a:stretch>
                       <a:fillRect/>
                     </a:stretch>
@@ -13726,11 +14386,11 @@
         <w:pStyle w:val="ImageCaption"/>
       </w:pPr>
       <w:r>
-        <w:t xml:space="preserve">Figure 3: (a) Time-averaged quantum SNR vs offered load; (b) asymptotic decoy-state BB84 secret key rate per session (×10⁻³ bits/pulse), 20-node Waxman.</w:t>
-      </w:r>
-    </w:p>
-    <w:bookmarkEnd w:id="38"/>
-    <w:bookmarkStart w:id="42" w:name="Xb0fcd2c67cb39404d67fd12e769c462abe51d20"/>
+        <w:t xml:space="preserve">Figure 4: (a) Time-averaged quantum SNR vs offered load; (b) asymptotic decoy-state BB84 secret key rate per session (×10⁻³ bits/pulse), 20-node Waxman.</w:t>
+      </w:r>
+    </w:p>
+    <w:bookmarkEnd w:id="41"/>
+    <w:bookmarkStart w:id="45" w:name="Xb0fcd2c67cb39404d67fd12e769c462abe51d20"/>
     <w:p>
       <w:pPr>
         <w:pStyle w:val="Heading2"/>
@@ -13753,7 +14413,7 @@
         <w:pStyle w:val="FirstParagraph"/>
       </w:pPr>
       <w:r>
-        <w:t xml:space="preserve">Figure 4(a) plots a 100-second trace of a monitored QKD link (</w:t>
+        <w:t xml:space="preserve">Figure 5(a) plots a 100-second trace of a monitored QKD link (</w:t>
       </w:r>
       <m:oMath>
         <m:r>
@@ -13919,7 +14579,7 @@
         <w:pStyle w:val="BodyText"/>
       </w:pPr>
       <w:r>
-        <w:t xml:space="preserve">Figure 4(b) evaluates betweenness-centrality placement of sparse O-E-O converters against uniform random and traffic-weighted degree placement. Because the C-band does not saturate at 80 Erlang (classical RBR 0.03% without and 0.02% with K = 4 on Waxman; 0.19% and 0.13% on Gabriel), the placement study is run at a spectrum-stress load of 250 Erlang on 20-node Gabriel topologies, where continuity blocking is significant. There, K = 4 betweenness-selected hubs reduce classical blocking from 10.1% (K = 0) to 5.3%, capturing 89.1% of the reduction achieved by conversion at every node (4.7%). At K = 4, uniform random placement gives 6.4% and traffic-weighted degree 6.0%. Across K, betweenness gives the most consistent reduction, but the confidence intervals of the three strategies overlap at this number of realisations.</w:t>
+        <w:t xml:space="preserve">Figure 5(b) evaluates betweenness-centrality placement of sparse O-E-O converters against uniform random and traffic-weighted degree placement. Because the C-band does not saturate at 80 Erlang (classical RBR 0.03% without and 0.02% with K = 4 on Waxman; 0.19% and 0.13% on Gabriel), the placement study is run at a spectrum-stress load of 250 Erlang on 20-node Gabriel topologies, where continuity blocking is significant. There, K = 4 betweenness-selected hubs reduce classical blocking from 10.1% (K = 0) to 5.3%, capturing 89.1% of the reduction achieved by conversion at every node (4.7%). At K = 4, uniform random placement gives 6.4% and traffic-weighted degree 6.0%. Across K, betweenness gives the most consistent reduction, but the confidence intervals of the three strategies overlap at this number of realisations.</w:t>
       </w:r>
     </w:p>
     <w:p>
@@ -13931,18 +14591,18 @@
           <wp:inline>
             <wp:extent cx="5334000" cy="2051538"/>
             <wp:effectExtent b="0" l="0" r="0" t="0"/>
-            <wp:docPr descr="Figure 4: (a) Real-time QSNR trajectory under bursts, static power control vs closed-loop T-DPC-RWA; (b) classical RBR vs number of sparse O-E-O converter nodes K." title="" id="40" name="Picture"/>
+            <wp:docPr descr="Figure 5: (a) Real-time QSNR trajectory under bursts, static power control vs closed-loop T-DPC-RWA; (b) classical RBR vs number of sparse O-E-O converter nodes K." title="" id="43" name="Picture"/>
             <a:graphic>
               <a:graphicData uri="http://schemas.openxmlformats.org/drawingml/2006/picture">
                 <pic:pic>
                   <pic:nvPicPr>
-                    <pic:cNvPr descr="fig/fig3_telemetry_oeo.png" id="41" name="Picture"/>
+                    <pic:cNvPr descr="fig/fig3_telemetry_oeo.png" id="44" name="Picture"/>
                     <pic:cNvPicPr>
                       <a:picLocks noChangeArrowheads="1" noChangeAspect="1"/>
                     </pic:cNvPicPr>
                   </pic:nvPicPr>
                   <pic:blipFill>
-                    <a:blip r:embed="rId39"/>
+                    <a:blip r:embed="rId42"/>
                     <a:stretch>
                       <a:fillRect/>
                     </a:stretch>
@@ -13974,11 +14634,11 @@
         <w:pStyle w:val="ImageCaption"/>
       </w:pPr>
       <w:r>
-        <w:t xml:space="preserve">Figure 4: (a) Real-time QSNR trajectory under bursts, static power control vs closed-loop T-DPC-RWA; (b) classical RBR vs number of sparse O-E-O converter nodes K.</w:t>
-      </w:r>
-    </w:p>
-    <w:bookmarkEnd w:id="42"/>
-    <w:bookmarkStart w:id="43" w:name="Xe6d15189d3e65f4962f7d69ceaae7028fce9954"/>
+        <w:t xml:space="preserve">Figure 5: (a) Real-time QSNR trajectory under bursts, static power control vs closed-loop T-DPC-RWA; (b) classical RBR vs number of sparse O-E-O converter nodes K.</w:t>
+      </w:r>
+    </w:p>
+    <w:bookmarkEnd w:id="45"/>
+    <w:bookmarkStart w:id="46" w:name="Xe6d15189d3e65f4962f7d69ceaae7028fce9954"/>
     <w:p>
       <w:pPr>
         <w:pStyle w:val="Heading2"/>
@@ -16307,8 +16967,8 @@
         </w:tc>
       </w:tr>
     </w:tbl>
-    <w:bookmarkEnd w:id="43"/>
-    <w:bookmarkStart w:id="44" w:name="discussion-and-threats-to-validity"/>
+    <w:bookmarkEnd w:id="46"/>
+    <w:bookmarkStart w:id="47" w:name="discussion-and-threats-to-validity"/>
     <w:p>
       <w:pPr>
         <w:pStyle w:val="Heading2"/>
@@ -16497,9 +17157,274 @@
         <w:t xml:space="preserve">, limiting single-segment reach to about 50 km and zeroing the BB84 key rate whenever QSNR falls below roughly +5 dB. A fixed mean photon number would change absolute QSNR and SKR values substantially. Second, classical bursts are a modelling assumption; their rate and power set the absolute outage figures. Third, the Raman model is co-propagating and undepleted, and telemetry is assumed exact. Fourth, 10 realisations of 20,000 requests give confidence intervals that overlap for some close comparisons, notably among O-E-O placement strategies. The simulator, all raw runs and all figure data are provided so every number here can be regenerated.</w:t>
       </w:r>
     </w:p>
-    <w:bookmarkEnd w:id="44"/>
-    <w:bookmarkEnd w:id="45"/>
-    <w:bookmarkStart w:id="46" w:name="conclusion"/>
+    <w:bookmarkEnd w:id="47"/>
+    <w:bookmarkStart w:id="48" w:name="Xf522f2107079ef7644f4d41d6c27961855c8deb"/>
+    <w:p>
+      <w:pPr>
+        <w:pStyle w:val="Heading2"/>
+      </w:pPr>
+      <w:r>
+        <w:rPr>
+          <w:rStyle w:val="SectionNumber"/>
+        </w:rPr>
+        <w:t xml:space="preserve">8.7</w:t>
+      </w:r>
+      <w:r>
+        <w:tab/>
+      </w:r>
+      <w:r>
+        <w:t xml:space="preserve">Reproducibility and Traceability of Reported Values</w:t>
+      </w:r>
+    </w:p>
+    <w:p>
+      <w:pPr>
+        <w:pStyle w:val="FirstParagraph"/>
+      </w:pPr>
+      <w:r>
+        <w:t xml:space="preserve">Every value reported in this section can be traced to its source. The simulator writes one row per simulation run (</w:t>
+      </w:r>
+      <w:r>
+        <w:rPr>
+          <w:rStyle w:val="VerbatimChar"/>
+        </w:rPr>
+        <w:t xml:space="preserve">raw_runs.csv</w:t>
+      </w:r>
+      <w:r>
+        <w:t xml:space="preserve">), averages these rows into the files behind each table and figure (</w:t>
+      </w:r>
+      <w:r>
+        <w:rPr>
+          <w:rStyle w:val="VerbatimChar"/>
+        </w:rPr>
+        <w:t xml:space="preserve">table2_ablation.csv</w:t>
+      </w:r>
+      <w:r>
+        <w:t xml:space="preserve">,</w:t>
+      </w:r>
+      <w:r>
+        <w:t xml:space="preserve"> </w:t>
+      </w:r>
+      <w:r>
+        <w:rPr>
+          <w:rStyle w:val="VerbatimChar"/>
+        </w:rPr>
+        <w:t xml:space="preserve">sweep_results.csv</w:t>
+      </w:r>
+      <w:r>
+        <w:t xml:space="preserve">,</w:t>
+      </w:r>
+      <w:r>
+        <w:t xml:space="preserve"> </w:t>
+      </w:r>
+      <w:r>
+        <w:rPr>
+          <w:rStyle w:val="VerbatimChar"/>
+        </w:rPr>
+        <w:t xml:space="preserve">oeo_k_sweep.csv</w:t>
+      </w:r>
+      <w:r>
+        <w:t xml:space="preserve">,</w:t>
+      </w:r>
+      <w:r>
+        <w:t xml:space="preserve"> </w:t>
+      </w:r>
+      <w:r>
+        <w:rPr>
+          <w:rStyle w:val="VerbatimChar"/>
+        </w:rPr>
+        <w:t xml:space="preserve">demo_trace.csv</w:t>
+      </w:r>
+      <w:r>
+        <w:t xml:space="preserve">), and the report text reads its numbers from those files rather than having them typed in. A verification script (</w:t>
+      </w:r>
+      <w:r>
+        <w:rPr>
+          <w:rStyle w:val="VerbatimChar"/>
+        </w:rPr>
+        <w:t xml:space="preserve">verify_values.py</w:t>
+      </w:r>
+      <w:r>
+        <w:t xml:space="preserve">) recomputes Eqs. (1)–(6) by hand from the parameters in Table 1 and checks each result against the simulator: for example, the monitored link of Section 8.4 has a noise-free QSNR of</w:t>
+      </w:r>
+      <w:r>
+        <w:t xml:space="preserve"> </w:t>
+      </w:r>
+      <m:oMath>
+        <m:r>
+          <m:t>10</m:t>
+        </m:r>
+        <m:sSub>
+          <m:e>
+            <m:r>
+              <m:rPr>
+                <m:sty m:val="p"/>
+              </m:rPr>
+              <m:t>log</m:t>
+            </m:r>
+          </m:e>
+          <m:sub>
+            <m:r>
+              <m:t>10</m:t>
+            </m:r>
+          </m:sub>
+        </m:sSub>
+        <m:d>
+          <m:dPr>
+            <m:begChr m:val="("/>
+            <m:sepChr m:val=""/>
+            <m:endChr m:val=")"/>
+            <m:grow/>
+          </m:dPr>
+          <m:e>
+            <m:sSubSup>
+              <m:e>
+                <m:r>
+                  <m:t>t</m:t>
+                </m:r>
+              </m:e>
+              <m:sub>
+                <m:r>
+                  <m:t>q</m:t>
+                </m:r>
+              </m:sub>
+              <m:sup>
+                <m:r>
+                  <m:t>2</m:t>
+                </m:r>
+              </m:sup>
+            </m:sSubSup>
+            <m:sSub>
+              <m:e>
+                <m:r>
+                  <m:t>η</m:t>
+                </m:r>
+              </m:e>
+              <m:sub>
+                <m:r>
+                  <m:t>D</m:t>
+                </m:r>
+              </m:sub>
+            </m:sSub>
+            <m:r>
+              <m:rPr>
+                <m:sty m:val="p"/>
+              </m:rPr>
+              <m:t>/</m:t>
+            </m:r>
+            <m:sSub>
+              <m:e>
+                <m:r>
+                  <m:t>N</m:t>
+                </m:r>
+              </m:e>
+              <m:sub>
+                <m:r>
+                  <m:t>F</m:t>
+                </m:r>
+              </m:sub>
+            </m:sSub>
+          </m:e>
+        </m:d>
+        <m:r>
+          <m:rPr>
+            <m:sty m:val="p"/>
+          </m:rPr>
+          <m:t>=</m:t>
+        </m:r>
+        <m:r>
+          <m:rPr>
+            <m:sty m:val="p"/>
+          </m:rPr>
+          <m:t>+</m:t>
+        </m:r>
+        <m:r>
+          <m:t>2.1</m:t>
+        </m:r>
+      </m:oMath>
+      <w:r>
+        <w:t xml:space="preserve"> </w:t>
+      </w:r>
+      <w:r>
+        <w:t xml:space="preserve">dB at 43.6 km, and the seven burst channels add</w:t>
+      </w:r>
+      <w:r>
+        <w:t xml:space="preserve"> </w:t>
+      </w:r>
+      <m:oMath>
+        <m:sSub>
+          <m:e>
+            <m:r>
+              <m:t>N</m:t>
+            </m:r>
+          </m:e>
+          <m:sub>
+            <m:r>
+              <m:t>R</m:t>
+            </m:r>
+          </m:sub>
+        </m:sSub>
+        <m:r>
+          <m:rPr>
+            <m:sty m:val="p"/>
+          </m:rPr>
+          <m:t>=</m:t>
+        </m:r>
+        <m:r>
+          <m:t>7</m:t>
+        </m:r>
+        <m:r>
+          <m:t>κ</m:t>
+        </m:r>
+        <m:r>
+          <m:rPr>
+            <m:sty m:val="p"/>
+          </m:rPr>
+          <m:t>=</m:t>
+        </m:r>
+        <m:r>
+          <m:t>3.6</m:t>
+        </m:r>
+        <m:r>
+          <m:rPr>
+            <m:sty m:val="p"/>
+          </m:rPr>
+          <m:t>×</m:t>
+        </m:r>
+        <m:sSup>
+          <m:e>
+            <m:r>
+              <m:t>10</m:t>
+            </m:r>
+          </m:e>
+          <m:sup>
+            <m:r>
+              <m:rPr>
+                <m:sty m:val="p"/>
+              </m:rPr>
+              <m:t>−</m:t>
+            </m:r>
+            <m:r>
+              <m:t>4</m:t>
+            </m:r>
+          </m:sup>
+        </m:sSup>
+      </m:oMath>
+      <w:r>
+        <w:t xml:space="preserve">, giving the logged −4.5 dB. The same script rebuilds each Table 2 entry as the mean of its 10 individual runs. A traceability map (</w:t>
+      </w:r>
+      <w:r>
+        <w:rPr>
+          <w:rStyle w:val="VerbatimChar"/>
+        </w:rPr>
+        <w:t xml:space="preserve">TRACEABILITY.md</w:t>
+      </w:r>
+      <w:r>
+        <w:t xml:space="preserve">) links every equation and every line of Algorithms 1 and 2 to the function and source line that implements it. The simulator, raw data, figures and this report are available at https://github.com/shreshth006/hybrid-qkd-rwa.</w:t>
+      </w:r>
+    </w:p>
+    <w:bookmarkEnd w:id="48"/>
+    <w:bookmarkEnd w:id="49"/>
+    <w:bookmarkStart w:id="50" w:name="conclusion"/>
     <w:p>
       <w:pPr>
         <w:pStyle w:val="Heading1"/>
@@ -16561,8 +17486,8 @@
         <w:t xml:space="preserve">Discrete-event simulation on 20-node Gabriel and Waxman topologies under stochastic Poisson traffic showed that, at 80 Erlang, the full framework reduces the Request Blocking Ratio by 59.8% (Gabriel) and 39.8% (Waxman) relative to static power-controlled MQCCO, reduces session outage time from 1.40% to 0.04%, increases network key throughput by 8.2%, and retains 98.4% classical transmitter power savings. The ablation attributes the blocking gain mainly to trusted relays, the outage gain to the telemetry loop, and shows sparse conversion to be valuable once the C-band saturates. Future work will incorporate finite-key security bounds, account for noisy telemetry estimates, study alternative photon-number models, and explore multi-band coexistence across S+C+L-band elastic optical infrastructures.</w:t>
       </w:r>
     </w:p>
-    <w:bookmarkEnd w:id="46"/>
-    <w:bookmarkStart w:id="47" w:name="references"/>
+    <w:bookmarkEnd w:id="50"/>
+    <w:bookmarkStart w:id="51" w:name="references"/>
     <w:p>
       <w:pPr>
         <w:pStyle w:val="Heading1"/>
@@ -16585,7 +17510,7 @@
         <w:pStyle w:val="Compact"/>
         <w:numPr>
           <w:ilvl w:val="0"/>
-          <w:numId w:val="1003"/>
+          <w:numId w:val="1004"/>
         </w:numPr>
       </w:pPr>
       <w:r>
@@ -16610,7 +17535,7 @@
         <w:pStyle w:val="Compact"/>
         <w:numPr>
           <w:ilvl w:val="0"/>
-          <w:numId w:val="1003"/>
+          <w:numId w:val="1004"/>
         </w:numPr>
       </w:pPr>
       <w:r>
@@ -16635,7 +17560,7 @@
         <w:pStyle w:val="Compact"/>
         <w:numPr>
           <w:ilvl w:val="0"/>
-          <w:numId w:val="1003"/>
+          <w:numId w:val="1004"/>
         </w:numPr>
       </w:pPr>
       <w:r>
@@ -16660,7 +17585,7 @@
         <w:pStyle w:val="Compact"/>
         <w:numPr>
           <w:ilvl w:val="0"/>
-          <w:numId w:val="1003"/>
+          <w:numId w:val="1004"/>
         </w:numPr>
       </w:pPr>
       <w:r>
@@ -16685,7 +17610,7 @@
         <w:pStyle w:val="Compact"/>
         <w:numPr>
           <w:ilvl w:val="0"/>
-          <w:numId w:val="1003"/>
+          <w:numId w:val="1004"/>
         </w:numPr>
       </w:pPr>
       <w:r>
@@ -16713,7 +17638,7 @@
         <w:pStyle w:val="Compact"/>
         <w:numPr>
           <w:ilvl w:val="0"/>
-          <w:numId w:val="1003"/>
+          <w:numId w:val="1004"/>
         </w:numPr>
       </w:pPr>
       <w:r>
@@ -16738,7 +17663,7 @@
         <w:pStyle w:val="Compact"/>
         <w:numPr>
           <w:ilvl w:val="0"/>
-          <w:numId w:val="1003"/>
+          <w:numId w:val="1004"/>
         </w:numPr>
       </w:pPr>
       <w:r>
@@ -16763,7 +17688,7 @@
         <w:pStyle w:val="Compact"/>
         <w:numPr>
           <w:ilvl w:val="0"/>
-          <w:numId w:val="1003"/>
+          <w:numId w:val="1004"/>
         </w:numPr>
       </w:pPr>
       <w:r>
@@ -16788,7 +17713,7 @@
         <w:pStyle w:val="Compact"/>
         <w:numPr>
           <w:ilvl w:val="0"/>
-          <w:numId w:val="1003"/>
+          <w:numId w:val="1004"/>
         </w:numPr>
       </w:pPr>
       <w:r>
@@ -16813,7 +17738,7 @@
         <w:pStyle w:val="Compact"/>
         <w:numPr>
           <w:ilvl w:val="0"/>
-          <w:numId w:val="1003"/>
+          <w:numId w:val="1004"/>
         </w:numPr>
       </w:pPr>
       <w:r>
@@ -16838,7 +17763,7 @@
         <w:pStyle w:val="Compact"/>
         <w:numPr>
           <w:ilvl w:val="0"/>
-          <w:numId w:val="1003"/>
+          <w:numId w:val="1004"/>
         </w:numPr>
       </w:pPr>
       <w:r>
@@ -16863,7 +17788,7 @@
         <w:pStyle w:val="Compact"/>
         <w:numPr>
           <w:ilvl w:val="0"/>
-          <w:numId w:val="1003"/>
+          <w:numId w:val="1004"/>
         </w:numPr>
       </w:pPr>
       <w:r>
@@ -16888,7 +17813,7 @@
         <w:pStyle w:val="Compact"/>
         <w:numPr>
           <w:ilvl w:val="0"/>
-          <w:numId w:val="1003"/>
+          <w:numId w:val="1004"/>
         </w:numPr>
       </w:pPr>
       <w:r>
@@ -16916,7 +17841,7 @@
         <w:pStyle w:val="Compact"/>
         <w:numPr>
           <w:ilvl w:val="0"/>
-          <w:numId w:val="1003"/>
+          <w:numId w:val="1004"/>
         </w:numPr>
       </w:pPr>
       <w:r>
@@ -16941,7 +17866,7 @@
         <w:pStyle w:val="Compact"/>
         <w:numPr>
           <w:ilvl w:val="0"/>
-          <w:numId w:val="1003"/>
+          <w:numId w:val="1004"/>
         </w:numPr>
       </w:pPr>
       <w:r>
@@ -16953,7 +17878,7 @@
         <w:pStyle w:val="Compact"/>
         <w:numPr>
           <w:ilvl w:val="0"/>
-          <w:numId w:val="1003"/>
+          <w:numId w:val="1004"/>
         </w:numPr>
       </w:pPr>
       <w:r>
@@ -16965,7 +17890,7 @@
         <w:pStyle w:val="Compact"/>
         <w:numPr>
           <w:ilvl w:val="0"/>
-          <w:numId w:val="1003"/>
+          <w:numId w:val="1004"/>
         </w:numPr>
       </w:pPr>
       <w:r>
@@ -16977,7 +17902,7 @@
         <w:pStyle w:val="Compact"/>
         <w:numPr>
           <w:ilvl w:val="0"/>
-          <w:numId w:val="1003"/>
+          <w:numId w:val="1004"/>
         </w:numPr>
       </w:pPr>
       <w:r>
@@ -17002,7 +17927,7 @@
         <w:pStyle w:val="Compact"/>
         <w:numPr>
           <w:ilvl w:val="0"/>
-          <w:numId w:val="1003"/>
+          <w:numId w:val="1004"/>
         </w:numPr>
       </w:pPr>
       <w:r>
@@ -17027,7 +17952,7 @@
         <w:pStyle w:val="Compact"/>
         <w:numPr>
           <w:ilvl w:val="0"/>
-          <w:numId w:val="1003"/>
+          <w:numId w:val="1004"/>
         </w:numPr>
       </w:pPr>
       <w:r>
@@ -17047,7 +17972,438 @@
         <w:t xml:space="preserve">, 23(8), 1003. https://doi.org/10.3390/e23081003</w:t>
       </w:r>
     </w:p>
-    <w:bookmarkEnd w:id="47"/>
+    <w:p>
+      <w:pPr>
+        <w:pStyle w:val="Compact"/>
+        <w:numPr>
+          <w:ilvl w:val="0"/>
+          <w:numId w:val="1004"/>
+        </w:numPr>
+      </w:pPr>
+      <w:r>
+        <w:t xml:space="preserve">Chapuran, T. E., Toliver, P., Peters, N. A., Jackel, J., Goodman, M. S., Runser, R. J., McNown, S. R., Dallmann, N., Hughes, R. J., McCabe, K. P., Nordholt, J. E., Peterson, C. G., Tyagi, K. T., Mercer, L., &amp; Dardy, H. (2009). Optical networking for quantum key distribution and quantum communications.</w:t>
+      </w:r>
+      <w:r>
+        <w:t xml:space="preserve"> </w:t>
+      </w:r>
+      <w:r>
+        <w:rPr>
+          <w:i/>
+          <w:iCs/>
+        </w:rPr>
+        <w:t xml:space="preserve">New Journal of Physics</w:t>
+      </w:r>
+      <w:r>
+        <w:t xml:space="preserve">, 11, 105001.</w:t>
+      </w:r>
+    </w:p>
+    <w:p>
+      <w:pPr>
+        <w:pStyle w:val="Compact"/>
+        <w:numPr>
+          <w:ilvl w:val="0"/>
+          <w:numId w:val="1004"/>
+        </w:numPr>
+      </w:pPr>
+      <w:r>
+        <w:t xml:space="preserve">Eraerds, P., Walenta, N., Legré, M., Gisin, N., &amp; Zbinden, H. (2010). Quantum key distribution and 1 Gbps data encryption over a single fibre.</w:t>
+      </w:r>
+      <w:r>
+        <w:t xml:space="preserve"> </w:t>
+      </w:r>
+      <w:r>
+        <w:rPr>
+          <w:i/>
+          <w:iCs/>
+        </w:rPr>
+        <w:t xml:space="preserve">New Journal of Physics</w:t>
+      </w:r>
+      <w:r>
+        <w:t xml:space="preserve">, 12, 063027. https://doi.org/10.1088/1367-2630/12/6/063027</w:t>
+      </w:r>
+    </w:p>
+    <w:p>
+      <w:pPr>
+        <w:pStyle w:val="Compact"/>
+        <w:numPr>
+          <w:ilvl w:val="0"/>
+          <w:numId w:val="1004"/>
+        </w:numPr>
+      </w:pPr>
+      <w:r>
+        <w:t xml:space="preserve">Patel, K. A., Dynes, J. F., Choi, I., Sharpe, A. W., Dixon, A. R., Yuan, Z. L., Penty, R. V., &amp; Shields, A. J. (2012). Coexistence of high-bit-rate quantum key distribution and data on optical fiber.</w:t>
+      </w:r>
+      <w:r>
+        <w:t xml:space="preserve"> </w:t>
+      </w:r>
+      <w:r>
+        <w:rPr>
+          <w:i/>
+          <w:iCs/>
+        </w:rPr>
+        <w:t xml:space="preserve">Physical Review X</w:t>
+      </w:r>
+      <w:r>
+        <w:t xml:space="preserve">, 2(4), 041010.</w:t>
+      </w:r>
+    </w:p>
+    <w:p>
+      <w:pPr>
+        <w:pStyle w:val="Compact"/>
+        <w:numPr>
+          <w:ilvl w:val="0"/>
+          <w:numId w:val="1004"/>
+        </w:numPr>
+      </w:pPr>
+      <w:r>
+        <w:t xml:space="preserve">Ferreira da Silva, T., Xavier, G. B., Temporão, G. P., &amp; von der Weid, J. P. (2014). Impact of Raman scattered noise from multiple telecom channels on fiber-optic quantum key distribution systems.</w:t>
+      </w:r>
+      <w:r>
+        <w:t xml:space="preserve"> </w:t>
+      </w:r>
+      <w:r>
+        <w:rPr>
+          <w:i/>
+          <w:iCs/>
+        </w:rPr>
+        <w:t xml:space="preserve">Journal of Lightwave Technology</w:t>
+      </w:r>
+      <w:r>
+        <w:t xml:space="preserve">, 32, 2332–2339.</w:t>
+      </w:r>
+    </w:p>
+    <w:p>
+      <w:pPr>
+        <w:pStyle w:val="Compact"/>
+        <w:numPr>
+          <w:ilvl w:val="0"/>
+          <w:numId w:val="1004"/>
+        </w:numPr>
+      </w:pPr>
+      <w:r>
+        <w:t xml:space="preserve">Birand, B., Wang, H., Bergman, K., Kilper, D., Nandagopal, T., &amp; Zussman, G. (2014). Real-time power control for dynamic optical networks—Algorithms and experimentation.</w:t>
+      </w:r>
+      <w:r>
+        <w:t xml:space="preserve"> </w:t>
+      </w:r>
+      <w:r>
+        <w:rPr>
+          <w:i/>
+          <w:iCs/>
+        </w:rPr>
+        <w:t xml:space="preserve">IEEE Journal on Selected Areas in Communications</w:t>
+      </w:r>
+      <w:r>
+        <w:t xml:space="preserve">, 32, 1615–1628.</w:t>
+      </w:r>
+    </w:p>
+    <w:p>
+      <w:pPr>
+        <w:pStyle w:val="Compact"/>
+        <w:numPr>
+          <w:ilvl w:val="0"/>
+          <w:numId w:val="1004"/>
+        </w:numPr>
+      </w:pPr>
+      <w:r>
+        <w:t xml:space="preserve">Zhang, Q., Ayoub, O., Gatto, A., Wu, J., Musumeci, F., &amp; Tornatore, M. (2023). Routing, channel, key-rate, and time-slot assignment for QKD in optical networks.</w:t>
+      </w:r>
+      <w:r>
+        <w:t xml:space="preserve"> </w:t>
+      </w:r>
+      <w:r>
+        <w:rPr>
+          <w:i/>
+          <w:iCs/>
+        </w:rPr>
+        <w:t xml:space="preserve">IEEE Transactions on Network and Service Management</w:t>
+      </w:r>
+      <w:r>
+        <w:t xml:space="preserve"> </w:t>
+      </w:r>
+      <w:r>
+        <w:t xml:space="preserve">(early access).</w:t>
+      </w:r>
+    </w:p>
+    <w:p>
+      <w:pPr>
+        <w:pStyle w:val="Compact"/>
+        <w:numPr>
+          <w:ilvl w:val="0"/>
+          <w:numId w:val="1004"/>
+        </w:numPr>
+      </w:pPr>
+      <w:r>
+        <w:t xml:space="preserve">Bennett, C. H., &amp; Brassard, G. (1984). Quantum cryptography: Public key distribution and coin tossing. In</w:t>
+      </w:r>
+      <w:r>
+        <w:t xml:space="preserve"> </w:t>
+      </w:r>
+      <w:r>
+        <w:rPr>
+          <w:i/>
+          <w:iCs/>
+        </w:rPr>
+        <w:t xml:space="preserve">Proc. IEEE International Conference on Computers, Systems and Signal Processing</w:t>
+      </w:r>
+      <w:r>
+        <w:t xml:space="preserve"> </w:t>
+      </w:r>
+      <w:r>
+        <w:t xml:space="preserve">(pp. 175–179). Bangalore, India.</w:t>
+      </w:r>
+    </w:p>
+    <w:p>
+      <w:pPr>
+        <w:pStyle w:val="Compact"/>
+        <w:numPr>
+          <w:ilvl w:val="0"/>
+          <w:numId w:val="1004"/>
+        </w:numPr>
+      </w:pPr>
+      <w:r>
+        <w:t xml:space="preserve">Scarani, V., Bechmann-Pasquinucci, H., Cerf, N. J., Dušek, M., Lütkenhaus, N., &amp; Peev, M. (2009). The security of practical quantum key distribution.</w:t>
+      </w:r>
+      <w:r>
+        <w:t xml:space="preserve"> </w:t>
+      </w:r>
+      <w:r>
+        <w:rPr>
+          <w:i/>
+          <w:iCs/>
+        </w:rPr>
+        <w:t xml:space="preserve">Reviews of Modern Physics</w:t>
+      </w:r>
+      <w:r>
+        <w:t xml:space="preserve">, 81(3), 1301.</w:t>
+      </w:r>
+    </w:p>
+    <w:p>
+      <w:pPr>
+        <w:pStyle w:val="Compact"/>
+        <w:numPr>
+          <w:ilvl w:val="0"/>
+          <w:numId w:val="1004"/>
+        </w:numPr>
+      </w:pPr>
+      <w:r>
+        <w:t xml:space="preserve">Lo, H.-K., Ma, X., &amp; Chen, K. (2005). Decoy state quantum key distribution.</w:t>
+      </w:r>
+      <w:r>
+        <w:t xml:space="preserve"> </w:t>
+      </w:r>
+      <w:r>
+        <w:rPr>
+          <w:i/>
+          <w:iCs/>
+        </w:rPr>
+        <w:t xml:space="preserve">Physical Review Letters</w:t>
+      </w:r>
+      <w:r>
+        <w:t xml:space="preserve">, 94(23), 230504.</w:t>
+      </w:r>
+    </w:p>
+    <w:p>
+      <w:pPr>
+        <w:pStyle w:val="Compact"/>
+        <w:numPr>
+          <w:ilvl w:val="0"/>
+          <w:numId w:val="1004"/>
+        </w:numPr>
+      </w:pPr>
+      <w:r>
+        <w:t xml:space="preserve">Cao, Y., Zhao, Y., Wang, Q., Zhang, J., Ng, S. X., &amp; Hanzo, L. (2022). The evolution of quantum key distribution networks: On the road to the Qinternet.</w:t>
+      </w:r>
+      <w:r>
+        <w:t xml:space="preserve"> </w:t>
+      </w:r>
+      <w:r>
+        <w:rPr>
+          <w:i/>
+          <w:iCs/>
+        </w:rPr>
+        <w:t xml:space="preserve">IEEE Communications Surveys &amp; Tutorials</w:t>
+      </w:r>
+      <w:r>
+        <w:t xml:space="preserve">, 24, 839–894.</w:t>
+      </w:r>
+    </w:p>
+    <w:p>
+      <w:pPr>
+        <w:pStyle w:val="Compact"/>
+        <w:numPr>
+          <w:ilvl w:val="0"/>
+          <w:numId w:val="1004"/>
+        </w:numPr>
+      </w:pPr>
+      <w:r>
+        <w:t xml:space="preserve">Peters, N. A., Toliver, P., Chapuran, T. E., Runser, R. J., McNown, S. R., Peterson, C. G., Rosenberg, D., Dallmann, N., Hughes, R. J., McCabe, K. P., Nordholt, J. E., &amp; Tyagi, K. T. (2009). Dense wavelength multiplexing of 1550 nm QKD with strong classical channels in reconfigurable networking environments.</w:t>
+      </w:r>
+      <w:r>
+        <w:t xml:space="preserve"> </w:t>
+      </w:r>
+      <w:r>
+        <w:rPr>
+          <w:i/>
+          <w:iCs/>
+        </w:rPr>
+        <w:t xml:space="preserve">New Journal of Physics</w:t>
+      </w:r>
+      <w:r>
+        <w:t xml:space="preserve">, 11, 045012.</w:t>
+      </w:r>
+    </w:p>
+    <w:p>
+      <w:pPr>
+        <w:pStyle w:val="Compact"/>
+        <w:numPr>
+          <w:ilvl w:val="0"/>
+          <w:numId w:val="1004"/>
+        </w:numPr>
+      </w:pPr>
+      <w:r>
+        <w:t xml:space="preserve">Chlamtac, I., Ganz, A., &amp; Karmi, G. (1992). Lightpath communications: An approach to high bandwidth optical WAN’s.</w:t>
+      </w:r>
+      <w:r>
+        <w:t xml:space="preserve"> </w:t>
+      </w:r>
+      <w:r>
+        <w:rPr>
+          <w:i/>
+          <w:iCs/>
+        </w:rPr>
+        <w:t xml:space="preserve">IEEE Transactions on Communications</w:t>
+      </w:r>
+      <w:r>
+        <w:t xml:space="preserve">, 40, 1171–1182.</w:t>
+      </w:r>
+    </w:p>
+    <w:p>
+      <w:pPr>
+        <w:pStyle w:val="Compact"/>
+        <w:numPr>
+          <w:ilvl w:val="0"/>
+          <w:numId w:val="1004"/>
+        </w:numPr>
+      </w:pPr>
+      <w:r>
+        <w:t xml:space="preserve">Zang, H., Jue, J. P., &amp; Mukherjee, B. (2000). A review of routing and wavelength assignment approaches for wavelength-routed optical WDM networks.</w:t>
+      </w:r>
+      <w:r>
+        <w:t xml:space="preserve"> </w:t>
+      </w:r>
+      <w:r>
+        <w:rPr>
+          <w:i/>
+          <w:iCs/>
+        </w:rPr>
+        <w:t xml:space="preserve">Optical Networks Magazine</w:t>
+      </w:r>
+      <w:r>
+        <w:t xml:space="preserve">, 1, 47–60.</w:t>
+      </w:r>
+    </w:p>
+    <w:p>
+      <w:pPr>
+        <w:pStyle w:val="Compact"/>
+        <w:numPr>
+          <w:ilvl w:val="0"/>
+          <w:numId w:val="1004"/>
+        </w:numPr>
+      </w:pPr>
+      <w:r>
+        <w:t xml:space="preserve">Gabriel, K. R., &amp; Sokal, R. R. (1969). A new statistical approach to geographic variation analysis.</w:t>
+      </w:r>
+      <w:r>
+        <w:t xml:space="preserve"> </w:t>
+      </w:r>
+      <w:r>
+        <w:rPr>
+          <w:i/>
+          <w:iCs/>
+        </w:rPr>
+        <w:t xml:space="preserve">Systematic Zoology</w:t>
+      </w:r>
+      <w:r>
+        <w:t xml:space="preserve">, 18(3), 259–278.</w:t>
+      </w:r>
+    </w:p>
+    <w:p>
+      <w:pPr>
+        <w:pStyle w:val="Compact"/>
+        <w:numPr>
+          <w:ilvl w:val="0"/>
+          <w:numId w:val="1004"/>
+        </w:numPr>
+      </w:pPr>
+      <w:r>
+        <w:t xml:space="preserve">Waxman, B. M. (1988). Routing of multipoint connections.</w:t>
+      </w:r>
+      <w:r>
+        <w:t xml:space="preserve"> </w:t>
+      </w:r>
+      <w:r>
+        <w:rPr>
+          <w:i/>
+          <w:iCs/>
+        </w:rPr>
+        <w:t xml:space="preserve">IEEE Journal on Selected Areas in Communications</w:t>
+      </w:r>
+      <w:r>
+        <w:t xml:space="preserve">, 6(9), 1617–1622.</w:t>
+      </w:r>
+    </w:p>
+    <w:p>
+      <w:pPr>
+        <w:pStyle w:val="Compact"/>
+        <w:numPr>
+          <w:ilvl w:val="0"/>
+          <w:numId w:val="1004"/>
+        </w:numPr>
+      </w:pPr>
+      <w:r>
+        <w:t xml:space="preserve">Subramaniam, S., Azizoglu, M., &amp; Somani, A. K. (1996). All-optical networks with sparse wavelength conversion.</w:t>
+      </w:r>
+      <w:r>
+        <w:t xml:space="preserve"> </w:t>
+      </w:r>
+      <w:r>
+        <w:rPr>
+          <w:i/>
+          <w:iCs/>
+        </w:rPr>
+        <w:t xml:space="preserve">IEEE/ACM Transactions on Networking</w:t>
+      </w:r>
+      <w:r>
+        <w:t xml:space="preserve">, 4(4), 544–557.</w:t>
+      </w:r>
+    </w:p>
+    <w:p>
+      <w:pPr>
+        <w:pStyle w:val="Compact"/>
+        <w:numPr>
+          <w:ilvl w:val="0"/>
+          <w:numId w:val="1004"/>
+        </w:numPr>
+      </w:pPr>
+      <w:r>
+        <w:t xml:space="preserve">Brandes, U. (2001). A faster algorithm for betweenness centrality.</w:t>
+      </w:r>
+      <w:r>
+        <w:t xml:space="preserve"> </w:t>
+      </w:r>
+      <w:r>
+        <w:rPr>
+          <w:i/>
+          <w:iCs/>
+        </w:rPr>
+        <w:t xml:space="preserve">Journal of Mathematical Sociology</w:t>
+      </w:r>
+      <w:r>
+        <w:t xml:space="preserve">, 25(2), 163–177.</w:t>
+      </w:r>
+    </w:p>
+    <w:bookmarkEnd w:id="51"/>
     <w:sectPr>
       <w:footnotePr>
         <w:numRestart w:val="eachSect"/>
@@ -17249,6 +18605,109 @@
       <w:pPr>
         <w:ind w:left="6480" w:hanging="360"/>
       </w:pPr>
+    </w:lvl>
+  </w:abstractNum>
+  <w:abstractNum w:abstractNumId="991">
+    <w:nsid w:val="0000A991"/>
+    <w:multiLevelType w:val="multilevel"/>
+    <w:lvl w:ilvl="0">
+      <w:numFmt w:val="bullet"/>
+      <w:lvlText w:val=""/>
+      <w:lvlJc w:val="left"/>
+      <w:pPr>
+        <w:ind w:left="720" w:hanging="360"/>
+      </w:pPr>
+      <w:rPr>
+        <w:rFonts w:ascii="Symbol" w:hAnsi="Symbol" w:cs="Symbol" w:hint="default"/>
+      </w:rPr>
+    </w:lvl>
+    <w:lvl w:ilvl="1">
+      <w:numFmt w:val="bullet"/>
+      <w:lvlText w:val="o"/>
+      <w:lvlJc w:val="left"/>
+      <w:pPr>
+        <w:ind w:left="1440" w:hanging="360"/>
+      </w:pPr>
+      <w:rPr>
+        <w:rFonts w:ascii="Courier New" w:hAnsi="Courier New" w:cs="Courier New" w:hint="default"/>
+      </w:rPr>
+    </w:lvl>
+    <w:lvl w:ilvl="2">
+      <w:numFmt w:val="bullet"/>
+      <w:lvlText w:val=""/>
+      <w:lvlJc w:val="left"/>
+      <w:pPr>
+        <w:ind w:left="2160" w:hanging="360"/>
+      </w:pPr>
+      <w:rPr>
+        <w:rFonts w:ascii="Wingdings" w:hAnsi="Wingdings" w:cs="Wingdings" w:hint="default"/>
+      </w:rPr>
+    </w:lvl>
+    <w:lvl w:ilvl="3">
+      <w:numFmt w:val="bullet"/>
+      <w:lvlText w:val=""/>
+      <w:lvlJc w:val="left"/>
+      <w:pPr>
+        <w:ind w:left="2880" w:hanging="360"/>
+      </w:pPr>
+      <w:rPr>
+        <w:rFonts w:ascii="Symbol" w:hAnsi="Symbol" w:cs="Symbol" w:hint="default"/>
+      </w:rPr>
+    </w:lvl>
+    <w:lvl w:ilvl="4">
+      <w:numFmt w:val="bullet"/>
+      <w:lvlText w:val="o"/>
+      <w:lvlJc w:val="left"/>
+      <w:pPr>
+        <w:ind w:left="3600" w:hanging="360"/>
+      </w:pPr>
+      <w:rPr>
+        <w:rFonts w:ascii="Courier New" w:hAnsi="Courier New" w:cs="Courier New" w:hint="default"/>
+      </w:rPr>
+    </w:lvl>
+    <w:lvl w:ilvl="5">
+      <w:numFmt w:val="bullet"/>
+      <w:lvlText w:val=""/>
+      <w:lvlJc w:val="left"/>
+      <w:pPr>
+        <w:ind w:left="4320" w:hanging="360"/>
+      </w:pPr>
+      <w:rPr>
+        <w:rFonts w:ascii="Wingdings" w:hAnsi="Wingdings" w:cs="Wingdings" w:hint="default"/>
+      </w:rPr>
+    </w:lvl>
+    <w:lvl w:ilvl="6">
+      <w:numFmt w:val="bullet"/>
+      <w:lvlText w:val=""/>
+      <w:lvlJc w:val="left"/>
+      <w:pPr>
+        <w:ind w:left="5040" w:hanging="360"/>
+      </w:pPr>
+      <w:rPr>
+        <w:rFonts w:ascii="Symbol" w:hAnsi="Symbol" w:cs="Symbol" w:hint="default"/>
+      </w:rPr>
+    </w:lvl>
+    <w:lvl w:ilvl="7">
+      <w:numFmt w:val="bullet"/>
+      <w:lvlText w:val="o"/>
+      <w:lvlJc w:val="left"/>
+      <w:pPr>
+        <w:ind w:left="5760" w:hanging="360"/>
+      </w:pPr>
+      <w:rPr>
+        <w:rFonts w:ascii="Courier New" w:hAnsi="Courier New" w:cs="Courier New" w:hint="default"/>
+      </w:rPr>
+    </w:lvl>
+    <w:lvl w:ilvl="8">
+      <w:numFmt w:val="bullet"/>
+      <w:lvlText w:val=""/>
+      <w:lvlJc w:val="left"/>
+      <w:pPr>
+        <w:ind w:left="6480" w:hanging="360"/>
+      </w:pPr>
+      <w:rPr>
+        <w:rFonts w:ascii="Wingdings" w:hAnsi="Wingdings" w:cs="Wingdings" w:hint="default"/>
+      </w:rPr>
     </w:lvl>
   </w:abstractNum>
   <w:num w:numId="1000">
@@ -17285,6 +18744,9 @@
     </w:lvlOverride>
   </w:num>
   <w:num w:numId="1002">
+    <w:abstractNumId w:val="991"/>
+  </w:num>
+  <w:num w:numId="1003">
     <w:abstractNumId w:val="99411"/>
     <w:lvlOverride w:ilvl="0">
       <w:startOverride w:val="1"/>
@@ -17314,7 +18776,7 @@
       <w:startOverride w:val="1"/>
     </w:lvlOverride>
   </w:num>
-  <w:num w:numId="1003">
+  <w:num w:numId="1004">
     <w:abstractNumId w:val="99411"/>
     <w:lvlOverride w:ilvl="0">
       <w:startOverride w:val="1"/>

</xml_diff>